<commit_message>
feat: requisitos nao funcionais
</commit_message>
<xml_diff>
--- a/ApêndiceB-Requisitos/PID_RequisitosNãoFuncionais.docx
+++ b/ApêndiceB-Requisitos/PID_RequisitosNãoFuncionais.docx
@@ -1,6 +1,6 @@
 
 <file path=word/document.xml><?xml version="1.0" encoding="utf-8"?>
-<w:document xmlns:wpc="http://schemas.microsoft.com/office/word/2010/wordprocessingCanvas" xmlns:cx="http://schemas.microsoft.com/office/drawing/2014/chartex" xmlns:cx1="http://schemas.microsoft.com/office/drawing/2015/9/8/chartex" xmlns:mc="http://schemas.openxmlformats.org/markup-compatibility/2006" xmlns:o="urn:schemas-microsoft-com:office:office" xmlns:r="http://schemas.openxmlformats.org/officeDocument/2006/relationships" xmlns:m="http://schemas.openxmlformats.org/officeDocument/2006/math" xmlns:v="urn:schemas-microsoft-com:vml" xmlns:wp14="http://schemas.microsoft.com/office/word/2010/wordprocessingDrawing" xmlns:wp="http://schemas.openxmlformats.org/drawingml/2006/wordprocessingDrawing" xmlns:w10="urn:schemas-microsoft-com:office:word" xmlns:w="http://schemas.openxmlformats.org/wordprocessingml/2006/main" xmlns:w14="http://schemas.microsoft.com/office/word/2010/wordml" xmlns:w15="http://schemas.microsoft.com/office/word/2012/wordml" xmlns:w16se="http://schemas.microsoft.com/office/word/2015/wordml/symex" xmlns:wpg="http://schemas.microsoft.com/office/word/2010/wordprocessingGroup" xmlns:wpi="http://schemas.microsoft.com/office/word/2010/wordprocessingInk" xmlns:wne="http://schemas.microsoft.com/office/word/2006/wordml" xmlns:wps="http://schemas.microsoft.com/office/word/2010/wordprocessingShape" mc:Ignorable="w14 w15 w16se wp14">
+<w:document xmlns:wpc="http://schemas.microsoft.com/office/word/2010/wordprocessingCanvas" xmlns:cx="http://schemas.microsoft.com/office/drawing/2014/chartex" xmlns:cx1="http://schemas.microsoft.com/office/drawing/2015/9/8/chartex" xmlns:cx2="http://schemas.microsoft.com/office/drawing/2015/10/21/chartex" xmlns:cx3="http://schemas.microsoft.com/office/drawing/2016/5/9/chartex" xmlns:cx4="http://schemas.microsoft.com/office/drawing/2016/5/10/chartex" xmlns:cx5="http://schemas.microsoft.com/office/drawing/2016/5/11/chartex" xmlns:cx6="http://schemas.microsoft.com/office/drawing/2016/5/12/chartex" xmlns:cx7="http://schemas.microsoft.com/office/drawing/2016/5/13/chartex" xmlns:cx8="http://schemas.microsoft.com/office/drawing/2016/5/14/chartex" xmlns:mc="http://schemas.openxmlformats.org/markup-compatibility/2006" xmlns:aink="http://schemas.microsoft.com/office/drawing/2016/ink" xmlns:am3d="http://schemas.microsoft.com/office/drawing/2017/model3d" xmlns:o="urn:schemas-microsoft-com:office:office" xmlns:oel="http://schemas.microsoft.com/office/2019/extlst" xmlns:r="http://schemas.openxmlformats.org/officeDocument/2006/relationships" xmlns:m="http://schemas.openxmlformats.org/officeDocument/2006/math" xmlns:v="urn:schemas-microsoft-com:vml" xmlns:wp14="http://schemas.microsoft.com/office/word/2010/wordprocessingDrawing" xmlns:wp="http://schemas.openxmlformats.org/drawingml/2006/wordprocessingDrawing" xmlns:w10="urn:schemas-microsoft-com:office:word" xmlns:w="http://schemas.openxmlformats.org/wordprocessingml/2006/main" xmlns:w14="http://schemas.microsoft.com/office/word/2010/wordml" xmlns:w15="http://schemas.microsoft.com/office/word/2012/wordml" xmlns:w16cex="http://schemas.microsoft.com/office/word/2018/wordml/cex" xmlns:w16cid="http://schemas.microsoft.com/office/word/2016/wordml/cid" xmlns:w16="http://schemas.microsoft.com/office/word/2018/wordml" xmlns:w16du="http://schemas.microsoft.com/office/word/2023/wordml/word16du" xmlns:w16sdtdh="http://schemas.microsoft.com/office/word/2020/wordml/sdtdatahash" xmlns:w16sdtfl="http://schemas.microsoft.com/office/word/2024/wordml/sdtformatlock" xmlns:w16se="http://schemas.microsoft.com/office/word/2015/wordml/symex" xmlns:wpg="http://schemas.microsoft.com/office/word/2010/wordprocessingGroup" xmlns:wpi="http://schemas.microsoft.com/office/word/2010/wordprocessingInk" xmlns:wne="http://schemas.microsoft.com/office/word/2006/wordml" xmlns:wps="http://schemas.microsoft.com/office/word/2010/wordprocessingShape" mc:Ignorable="w14 w15 w16se w16cid w16 w16cex w16sdtdh w16sdtfl w16du wp14">
   <w:body>
     <w:p>
       <w:pPr>
@@ -141,6 +141,14 @@
                 <w:szCs w:val="24"/>
               </w:rPr>
             </w:pPr>
+            <w:r>
+              <w:rPr>
+                <w:rFonts w:ascii="Times New Roman" w:eastAsia="Arial" w:hAnsi="Times New Roman" w:cs="Times New Roman"/>
+                <w:sz w:val="24"/>
+                <w:szCs w:val="24"/>
+              </w:rPr>
+              <w:t>20/03/2026</w:t>
+            </w:r>
           </w:p>
         </w:tc>
       </w:tr>
@@ -184,6 +192,14 @@
                 <w:szCs w:val="24"/>
               </w:rPr>
             </w:pPr>
+            <w:r>
+              <w:rPr>
+                <w:rFonts w:ascii="Times New Roman" w:eastAsia="Arial" w:hAnsi="Times New Roman" w:cs="Times New Roman"/>
+                <w:sz w:val="24"/>
+                <w:szCs w:val="24"/>
+              </w:rPr>
+              <w:t>PetLink</w:t>
+            </w:r>
           </w:p>
         </w:tc>
       </w:tr>
@@ -241,6 +257,14 @@
                 <w:szCs w:val="24"/>
               </w:rPr>
             </w:pPr>
+            <w:r>
+              <w:rPr>
+                <w:rFonts w:ascii="Times New Roman" w:eastAsia="Arial" w:hAnsi="Times New Roman" w:cs="Times New Roman"/>
+                <w:sz w:val="24"/>
+                <w:szCs w:val="24"/>
+              </w:rPr>
+              <w:t>Rodrigo</w:t>
+            </w:r>
           </w:p>
         </w:tc>
       </w:tr>
@@ -374,6 +398,10 @@
     <w:p>
       <w:pPr>
         <w:pStyle w:val="Ttulo3"/>
+        <w:numPr>
+          <w:ilvl w:val="1"/>
+          <w:numId w:val="1"/>
+        </w:numPr>
         <w:rPr>
           <w:rFonts w:ascii="Times New Roman" w:hAnsi="Times New Roman" w:cs="Times New Roman"/>
           <w:color w:val="auto"/>
@@ -385,7 +413,7 @@
           <w:rFonts w:ascii="Times New Roman" w:hAnsi="Times New Roman" w:cs="Times New Roman"/>
           <w:color w:val="auto"/>
         </w:rPr>
-        <w:t>1.1 Usabilidade</w:t>
+        <w:t>Usabilidade</w:t>
       </w:r>
       <w:bookmarkEnd w:id="1"/>
     </w:p>
@@ -414,7 +442,15 @@
           <w:sz w:val="24"/>
           <w:szCs w:val="24"/>
         </w:rPr>
-        <w:t>RNF  1 – Nome</w:t>
+        <w:t>RNF  1 –</w:t>
+      </w:r>
+      <w:r>
+        <w:rPr>
+          <w:rFonts w:ascii="Times New Roman" w:hAnsi="Times New Roman" w:cs="Times New Roman"/>
+          <w:sz w:val="24"/>
+          <w:szCs w:val="24"/>
+        </w:rPr>
+        <w:t xml:space="preserve"> Facilidade de uso </w:t>
       </w:r>
     </w:p>
     <w:p>
@@ -433,6 +469,14 @@
         </w:rPr>
         <w:t xml:space="preserve">Descrição: </w:t>
       </w:r>
+      <w:r>
+        <w:rPr>
+          <w:rFonts w:ascii="Times New Roman" w:hAnsi="Times New Roman" w:cs="Times New Roman"/>
+          <w:sz w:val="24"/>
+          <w:szCs w:val="24"/>
+        </w:rPr>
+        <w:t>O sistema deve ser fácil de usar, com menus simples e organizados.</w:t>
+      </w:r>
     </w:p>
     <w:p>
       <w:pPr>
@@ -458,7 +502,15 @@
           <w:sz w:val="24"/>
           <w:szCs w:val="24"/>
         </w:rPr>
-        <w:t>RNF 2 – Nome</w:t>
+        <w:t xml:space="preserve">RNF 2 – </w:t>
+      </w:r>
+      <w:r>
+        <w:rPr>
+          <w:rFonts w:ascii="Times New Roman" w:hAnsi="Times New Roman" w:cs="Times New Roman"/>
+          <w:sz w:val="24"/>
+          <w:szCs w:val="24"/>
+        </w:rPr>
+        <w:t>Interface Clara</w:t>
       </w:r>
     </w:p>
     <w:p>
@@ -477,6 +529,14 @@
         </w:rPr>
         <w:t xml:space="preserve">Descrição: </w:t>
       </w:r>
+      <w:r>
+        <w:rPr>
+          <w:rFonts w:ascii="Times New Roman" w:hAnsi="Times New Roman" w:cs="Times New Roman"/>
+          <w:sz w:val="24"/>
+          <w:szCs w:val="24"/>
+        </w:rPr>
+        <w:t>As devem ser apresentadas de forma clara e compreensível</w:t>
+      </w:r>
     </w:p>
     <w:p>
       <w:pPr>
@@ -496,13 +556,20 @@
           <w:color w:val="auto"/>
         </w:rPr>
       </w:pPr>
+      <w:r>
+        <w:rPr>
+          <w:rFonts w:ascii="Times New Roman" w:hAnsi="Times New Roman" w:cs="Times New Roman"/>
+          <w:color w:val="auto"/>
+        </w:rPr>
+        <w:t xml:space="preserve">1.2 </w:t>
+      </w:r>
       <w:bookmarkStart w:id="2" w:name="_Toc98916002"/>
       <w:r>
         <w:rPr>
           <w:rFonts w:ascii="Times New Roman" w:hAnsi="Times New Roman" w:cs="Times New Roman"/>
           <w:color w:val="auto"/>
         </w:rPr>
-        <w:t>1.2 Eficiência</w:t>
+        <w:t>Eficiência</w:t>
       </w:r>
       <w:bookmarkEnd w:id="2"/>
     </w:p>
@@ -518,6 +585,80 @@
     </w:p>
     <w:p>
       <w:pPr>
+        <w:rPr>
+          <w:rFonts w:ascii="Times New Roman" w:hAnsi="Times New Roman" w:cs="Times New Roman"/>
+          <w:sz w:val="24"/>
+          <w:szCs w:val="24"/>
+        </w:rPr>
+      </w:pPr>
+      <w:r>
+        <w:rPr>
+          <w:rFonts w:ascii="Times New Roman" w:hAnsi="Times New Roman" w:cs="Times New Roman"/>
+          <w:sz w:val="24"/>
+          <w:szCs w:val="24"/>
+        </w:rPr>
+        <w:t xml:space="preserve">RNF  </w:t>
+      </w:r>
+      <w:r>
+        <w:rPr>
+          <w:rFonts w:ascii="Times New Roman" w:hAnsi="Times New Roman" w:cs="Times New Roman"/>
+          <w:sz w:val="24"/>
+          <w:szCs w:val="24"/>
+        </w:rPr>
+        <w:t>3</w:t>
+      </w:r>
+      <w:r>
+        <w:rPr>
+          <w:rFonts w:ascii="Times New Roman" w:hAnsi="Times New Roman" w:cs="Times New Roman"/>
+          <w:sz w:val="24"/>
+          <w:szCs w:val="24"/>
+        </w:rPr>
+        <w:t xml:space="preserve"> – </w:t>
+      </w:r>
+      <w:r>
+        <w:rPr>
+          <w:rFonts w:ascii="Times New Roman" w:hAnsi="Times New Roman" w:cs="Times New Roman"/>
+          <w:sz w:val="24"/>
+          <w:szCs w:val="24"/>
+        </w:rPr>
+        <w:t>Tempo de resposta</w:t>
+      </w:r>
+      <w:r>
+        <w:rPr>
+          <w:rFonts w:ascii="Times New Roman" w:hAnsi="Times New Roman" w:cs="Times New Roman"/>
+          <w:sz w:val="24"/>
+          <w:szCs w:val="24"/>
+        </w:rPr>
+        <w:t xml:space="preserve"> </w:t>
+      </w:r>
+    </w:p>
+    <w:p>
+      <w:pPr>
+        <w:rPr>
+          <w:rFonts w:ascii="Times New Roman" w:hAnsi="Times New Roman" w:cs="Times New Roman"/>
+          <w:sz w:val="24"/>
+          <w:szCs w:val="24"/>
+        </w:rPr>
+      </w:pPr>
+      <w:r>
+        <w:rPr>
+          <w:rFonts w:ascii="Times New Roman" w:hAnsi="Times New Roman" w:cs="Times New Roman"/>
+          <w:sz w:val="24"/>
+          <w:szCs w:val="24"/>
+        </w:rPr>
+        <w:t xml:space="preserve">Descrição: </w:t>
+      </w:r>
+      <w:r>
+        <w:rPr>
+          <w:rFonts w:ascii="Times New Roman" w:hAnsi="Times New Roman" w:cs="Times New Roman"/>
+          <w:sz w:val="24"/>
+          <w:szCs w:val="24"/>
+        </w:rPr>
+        <w:t>O sistema deve responder rapidamente às ações do usuário.</w:t>
+      </w:r>
+    </w:p>
+    <w:p>
+      <w:pPr>
         <w:pStyle w:val="Ttulo4"/>
         <w:rPr>
           <w:rFonts w:ascii="Times New Roman" w:hAnsi="Times New Roman" w:cs="Times New Roman"/>
@@ -562,6 +703,72 @@
           <w:rFonts w:ascii="Times New Roman" w:hAnsi="Times New Roman" w:cs="Times New Roman"/>
           <w:sz w:val="24"/>
           <w:szCs w:val="24"/>
+        </w:rPr>
+      </w:pPr>
+      <w:r>
+        <w:rPr>
+          <w:rFonts w:ascii="Times New Roman" w:hAnsi="Times New Roman" w:cs="Times New Roman"/>
+          <w:sz w:val="24"/>
+          <w:szCs w:val="24"/>
+        </w:rPr>
+        <w:t xml:space="preserve">RNF  </w:t>
+      </w:r>
+      <w:r>
+        <w:rPr>
+          <w:rFonts w:ascii="Times New Roman" w:hAnsi="Times New Roman" w:cs="Times New Roman"/>
+          <w:sz w:val="24"/>
+          <w:szCs w:val="24"/>
+        </w:rPr>
+        <w:t>4</w:t>
+      </w:r>
+      <w:r>
+        <w:rPr>
+          <w:rFonts w:ascii="Times New Roman" w:hAnsi="Times New Roman" w:cs="Times New Roman"/>
+          <w:sz w:val="24"/>
+          <w:szCs w:val="24"/>
+        </w:rPr>
+        <w:t xml:space="preserve"> – F</w:t>
+      </w:r>
+      <w:r>
+        <w:rPr>
+          <w:rFonts w:ascii="Times New Roman" w:hAnsi="Times New Roman" w:cs="Times New Roman"/>
+          <w:sz w:val="24"/>
+          <w:szCs w:val="24"/>
+        </w:rPr>
+        <w:t>uncionamento correto</w:t>
+      </w:r>
+    </w:p>
+    <w:p>
+      <w:pPr>
+        <w:rPr>
+          <w:rFonts w:ascii="Times New Roman" w:hAnsi="Times New Roman" w:cs="Times New Roman"/>
+          <w:sz w:val="24"/>
+          <w:szCs w:val="24"/>
+        </w:rPr>
+      </w:pPr>
+      <w:r>
+        <w:rPr>
+          <w:rFonts w:ascii="Times New Roman" w:hAnsi="Times New Roman" w:cs="Times New Roman"/>
+          <w:sz w:val="24"/>
+          <w:szCs w:val="24"/>
+        </w:rPr>
+        <w:t xml:space="preserve">Descrição: </w:t>
+      </w:r>
+      <w:r>
+        <w:rPr>
+          <w:rFonts w:ascii="Times New Roman" w:hAnsi="Times New Roman" w:cs="Times New Roman"/>
+          <w:sz w:val="24"/>
+          <w:szCs w:val="24"/>
+        </w:rPr>
+        <w:t>O sistema deve funcionar corretamente sem apresentar erros frequentes.</w:t>
+      </w:r>
+    </w:p>
+    <w:p>
+      <w:pPr>
+        <w:rPr>
+          <w:rFonts w:ascii="Times New Roman" w:hAnsi="Times New Roman" w:cs="Times New Roman"/>
+          <w:sz w:val="24"/>
+          <w:szCs w:val="24"/>
           <w:lang w:eastAsia="pt-BR"/>
         </w:rPr>
       </w:pPr>
@@ -601,6 +808,72 @@
           <w:szCs w:val="24"/>
         </w:rPr>
       </w:pPr>
+      <w:r>
+        <w:rPr>
+          <w:rFonts w:ascii="Times New Roman" w:hAnsi="Times New Roman" w:cs="Times New Roman"/>
+          <w:sz w:val="24"/>
+          <w:szCs w:val="24"/>
+        </w:rPr>
+        <w:t xml:space="preserve">RNF  </w:t>
+      </w:r>
+      <w:r>
+        <w:rPr>
+          <w:rFonts w:ascii="Times New Roman" w:hAnsi="Times New Roman" w:cs="Times New Roman"/>
+          <w:sz w:val="24"/>
+          <w:szCs w:val="24"/>
+        </w:rPr>
+        <w:t>5</w:t>
+      </w:r>
+      <w:r>
+        <w:rPr>
+          <w:rFonts w:ascii="Times New Roman" w:hAnsi="Times New Roman" w:cs="Times New Roman"/>
+          <w:sz w:val="24"/>
+          <w:szCs w:val="24"/>
+        </w:rPr>
+        <w:t xml:space="preserve"> – </w:t>
+      </w:r>
+      <w:r>
+        <w:rPr>
+          <w:rFonts w:ascii="Times New Roman" w:hAnsi="Times New Roman" w:cs="Times New Roman"/>
+          <w:sz w:val="24"/>
+          <w:szCs w:val="24"/>
+        </w:rPr>
+        <w:t>Acesso via navegador</w:t>
+      </w:r>
+    </w:p>
+    <w:p>
+      <w:pPr>
+        <w:rPr>
+          <w:rFonts w:ascii="Times New Roman" w:hAnsi="Times New Roman" w:cs="Times New Roman"/>
+          <w:sz w:val="24"/>
+          <w:szCs w:val="24"/>
+        </w:rPr>
+      </w:pPr>
+      <w:r>
+        <w:rPr>
+          <w:rFonts w:ascii="Times New Roman" w:hAnsi="Times New Roman" w:cs="Times New Roman"/>
+          <w:sz w:val="24"/>
+          <w:szCs w:val="24"/>
+        </w:rPr>
+        <w:t xml:space="preserve">Descrição: </w:t>
+      </w:r>
+      <w:r>
+        <w:rPr>
+          <w:rFonts w:ascii="Times New Roman" w:hAnsi="Times New Roman" w:cs="Times New Roman"/>
+          <w:sz w:val="24"/>
+          <w:szCs w:val="24"/>
+        </w:rPr>
+        <w:t>O sistema deve ser acessado por meio de um navegador de internet.</w:t>
+      </w:r>
+    </w:p>
+    <w:p>
+      <w:pPr>
+        <w:rPr>
+          <w:rFonts w:ascii="Times New Roman" w:hAnsi="Times New Roman" w:cs="Times New Roman"/>
+          <w:sz w:val="24"/>
+          <w:szCs w:val="24"/>
+        </w:rPr>
+      </w:pPr>
     </w:p>
     <w:p>
       <w:pPr>
@@ -624,9 +897,350 @@
         </w:rPr>
         <w:t xml:space="preserve">2. </w:t>
       </w:r>
-      <w:bookmarkStart w:id="6" w:name="_GoBack"/>
+      <w:r>
+        <w:rPr>
+          <w:rFonts w:ascii="Times New Roman" w:hAnsi="Times New Roman" w:cs="Times New Roman"/>
+          <w:b/>
+          <w:color w:val="auto"/>
+          <w:sz w:val="24"/>
+          <w:szCs w:val="24"/>
+        </w:rPr>
+        <w:t>Organizacional</w:t>
+      </w:r>
+      <w:bookmarkEnd w:id="5"/>
+    </w:p>
+    <w:p>
+      <w:pPr>
+        <w:pStyle w:val="Ttulo4"/>
+        <w:rPr>
+          <w:rFonts w:ascii="Times New Roman" w:hAnsi="Times New Roman" w:cs="Times New Roman"/>
+          <w:color w:val="auto"/>
+          <w:sz w:val="24"/>
+          <w:szCs w:val="24"/>
+        </w:rPr>
+      </w:pPr>
+    </w:p>
+    <w:p>
+      <w:pPr>
+        <w:pStyle w:val="Ttulo3"/>
+        <w:rPr>
+          <w:rFonts w:ascii="Times New Roman" w:hAnsi="Times New Roman" w:cs="Times New Roman"/>
+          <w:color w:val="auto"/>
+        </w:rPr>
+      </w:pPr>
+      <w:bookmarkStart w:id="6" w:name="_Toc98916006"/>
+      <w:r>
+        <w:rPr>
+          <w:rFonts w:ascii="Times New Roman" w:hAnsi="Times New Roman" w:cs="Times New Roman"/>
+          <w:color w:val="auto"/>
+        </w:rPr>
+        <w:t>2.1 Entrega</w:t>
+      </w:r>
       <w:bookmarkEnd w:id="6"/>
-      <w:r>
+    </w:p>
+    <w:p>
+      <w:pPr>
+        <w:rPr>
+          <w:rFonts w:ascii="Times New Roman" w:hAnsi="Times New Roman" w:cs="Times New Roman"/>
+          <w:sz w:val="24"/>
+          <w:szCs w:val="24"/>
+        </w:rPr>
+      </w:pPr>
+    </w:p>
+    <w:p>
+      <w:pPr>
+        <w:rPr>
+          <w:rFonts w:ascii="Times New Roman" w:hAnsi="Times New Roman" w:cs="Times New Roman"/>
+          <w:sz w:val="24"/>
+          <w:szCs w:val="24"/>
+        </w:rPr>
+      </w:pPr>
+      <w:r>
+        <w:rPr>
+          <w:rFonts w:ascii="Times New Roman" w:hAnsi="Times New Roman" w:cs="Times New Roman"/>
+          <w:sz w:val="24"/>
+          <w:szCs w:val="24"/>
+        </w:rPr>
+        <w:t xml:space="preserve">RNF  </w:t>
+      </w:r>
+      <w:r>
+        <w:rPr>
+          <w:rFonts w:ascii="Times New Roman" w:hAnsi="Times New Roman" w:cs="Times New Roman"/>
+          <w:sz w:val="24"/>
+          <w:szCs w:val="24"/>
+        </w:rPr>
+        <w:t>6</w:t>
+      </w:r>
+      <w:r>
+        <w:rPr>
+          <w:rFonts w:ascii="Times New Roman" w:hAnsi="Times New Roman" w:cs="Times New Roman"/>
+          <w:sz w:val="24"/>
+          <w:szCs w:val="24"/>
+        </w:rPr>
+        <w:t xml:space="preserve"> – </w:t>
+      </w:r>
+      <w:r>
+        <w:rPr>
+          <w:rFonts w:ascii="Times New Roman" w:hAnsi="Times New Roman" w:cs="Times New Roman"/>
+          <w:sz w:val="24"/>
+          <w:szCs w:val="24"/>
+        </w:rPr>
+        <w:t>Prazo</w:t>
+      </w:r>
+    </w:p>
+    <w:p>
+      <w:pPr>
+        <w:rPr>
+          <w:rFonts w:ascii="Times New Roman" w:hAnsi="Times New Roman" w:cs="Times New Roman"/>
+          <w:sz w:val="24"/>
+          <w:szCs w:val="24"/>
+        </w:rPr>
+      </w:pPr>
+      <w:r>
+        <w:rPr>
+          <w:rFonts w:ascii="Times New Roman" w:hAnsi="Times New Roman" w:cs="Times New Roman"/>
+          <w:sz w:val="24"/>
+          <w:szCs w:val="24"/>
+        </w:rPr>
+        <w:t xml:space="preserve">Descrição: </w:t>
+      </w:r>
+      <w:r>
+        <w:rPr>
+          <w:rFonts w:ascii="Times New Roman" w:hAnsi="Times New Roman" w:cs="Times New Roman"/>
+          <w:sz w:val="24"/>
+          <w:szCs w:val="24"/>
+        </w:rPr>
+        <w:t>O sistema deve ser entregue dentro do prazo definido.</w:t>
+      </w:r>
+    </w:p>
+    <w:p>
+      <w:pPr>
+        <w:rPr>
+          <w:rFonts w:ascii="Times New Roman" w:hAnsi="Times New Roman" w:cs="Times New Roman"/>
+          <w:sz w:val="24"/>
+          <w:szCs w:val="24"/>
+        </w:rPr>
+      </w:pPr>
+    </w:p>
+    <w:p>
+      <w:pPr>
+        <w:pStyle w:val="Ttulo3"/>
+        <w:rPr>
+          <w:rFonts w:ascii="Times New Roman" w:hAnsi="Times New Roman" w:cs="Times New Roman"/>
+          <w:color w:val="auto"/>
+        </w:rPr>
+      </w:pPr>
+      <w:bookmarkStart w:id="7" w:name="_Toc98916007"/>
+      <w:r>
+        <w:rPr>
+          <w:rFonts w:ascii="Times New Roman" w:hAnsi="Times New Roman" w:cs="Times New Roman"/>
+          <w:color w:val="auto"/>
+        </w:rPr>
+        <w:t>2.2 Implementação</w:t>
+      </w:r>
+      <w:bookmarkEnd w:id="7"/>
+    </w:p>
+    <w:p>
+      <w:pPr>
+        <w:pStyle w:val="Ttulo4"/>
+        <w:rPr>
+          <w:rFonts w:ascii="Times New Roman" w:hAnsi="Times New Roman" w:cs="Times New Roman"/>
+          <w:color w:val="auto"/>
+          <w:sz w:val="24"/>
+          <w:szCs w:val="24"/>
+        </w:rPr>
+      </w:pPr>
+    </w:p>
+    <w:p>
+      <w:pPr>
+        <w:rPr>
+          <w:rFonts w:ascii="Times New Roman" w:hAnsi="Times New Roman" w:cs="Times New Roman"/>
+          <w:sz w:val="24"/>
+          <w:szCs w:val="24"/>
+        </w:rPr>
+      </w:pPr>
+      <w:r>
+        <w:rPr>
+          <w:rFonts w:ascii="Times New Roman" w:hAnsi="Times New Roman" w:cs="Times New Roman"/>
+          <w:sz w:val="24"/>
+          <w:szCs w:val="24"/>
+        </w:rPr>
+        <w:t xml:space="preserve">RNF  </w:t>
+      </w:r>
+      <w:r>
+        <w:rPr>
+          <w:rFonts w:ascii="Times New Roman" w:hAnsi="Times New Roman" w:cs="Times New Roman"/>
+          <w:sz w:val="24"/>
+          <w:szCs w:val="24"/>
+        </w:rPr>
+        <w:t>7</w:t>
+      </w:r>
+      <w:r>
+        <w:rPr>
+          <w:rFonts w:ascii="Times New Roman" w:hAnsi="Times New Roman" w:cs="Times New Roman"/>
+          <w:sz w:val="24"/>
+          <w:szCs w:val="24"/>
+        </w:rPr>
+        <w:t xml:space="preserve"> – </w:t>
+      </w:r>
+      <w:r>
+        <w:rPr>
+          <w:rFonts w:ascii="Times New Roman" w:hAnsi="Times New Roman" w:cs="Times New Roman"/>
+          <w:sz w:val="24"/>
+          <w:szCs w:val="24"/>
+        </w:rPr>
+        <w:t>Tecnologias simples</w:t>
+      </w:r>
+    </w:p>
+    <w:p>
+      <w:pPr>
+        <w:rPr>
+          <w:rFonts w:ascii="Times New Roman" w:hAnsi="Times New Roman" w:cs="Times New Roman"/>
+          <w:sz w:val="24"/>
+          <w:szCs w:val="24"/>
+        </w:rPr>
+      </w:pPr>
+      <w:r>
+        <w:rPr>
+          <w:rFonts w:ascii="Times New Roman" w:hAnsi="Times New Roman" w:cs="Times New Roman"/>
+          <w:sz w:val="24"/>
+          <w:szCs w:val="24"/>
+        </w:rPr>
+        <w:t xml:space="preserve">Descrição: </w:t>
+      </w:r>
+      <w:r>
+        <w:rPr>
+          <w:rFonts w:ascii="Times New Roman" w:hAnsi="Times New Roman" w:cs="Times New Roman"/>
+          <w:sz w:val="24"/>
+          <w:szCs w:val="24"/>
+        </w:rPr>
+        <w:t>O sistema deve ser desenvolvido utilizando tecnologias básicas de desenvolvimento web.</w:t>
+      </w:r>
+    </w:p>
+    <w:p>
+      <w:pPr>
+        <w:rPr>
+          <w:rFonts w:ascii="Times New Roman" w:hAnsi="Times New Roman" w:cs="Times New Roman"/>
+          <w:sz w:val="24"/>
+          <w:szCs w:val="24"/>
+          <w:lang w:eastAsia="pt-BR"/>
+        </w:rPr>
+      </w:pPr>
+    </w:p>
+    <w:p>
+      <w:pPr>
+        <w:pStyle w:val="Ttulo3"/>
+        <w:rPr>
+          <w:rFonts w:ascii="Times New Roman" w:hAnsi="Times New Roman" w:cs="Times New Roman"/>
+          <w:color w:val="auto"/>
+        </w:rPr>
+      </w:pPr>
+      <w:bookmarkStart w:id="8" w:name="_Toc98916008"/>
+      <w:r>
+        <w:rPr>
+          <w:rFonts w:ascii="Times New Roman" w:hAnsi="Times New Roman" w:cs="Times New Roman"/>
+          <w:color w:val="auto"/>
+        </w:rPr>
+        <w:t>2.3 Padrão</w:t>
+      </w:r>
+      <w:bookmarkEnd w:id="8"/>
+    </w:p>
+    <w:p>
+      <w:pPr>
+        <w:pStyle w:val="Ttulo3"/>
+        <w:rPr>
+          <w:rFonts w:ascii="Times New Roman" w:hAnsi="Times New Roman" w:cs="Times New Roman"/>
+          <w:color w:val="auto"/>
+        </w:rPr>
+      </w:pPr>
+    </w:p>
+    <w:p>
+      <w:pPr>
+        <w:rPr>
+          <w:rFonts w:ascii="Times New Roman" w:hAnsi="Times New Roman" w:cs="Times New Roman"/>
+          <w:sz w:val="24"/>
+          <w:szCs w:val="24"/>
+        </w:rPr>
+      </w:pPr>
+      <w:r>
+        <w:rPr>
+          <w:rFonts w:ascii="Times New Roman" w:hAnsi="Times New Roman" w:cs="Times New Roman"/>
+          <w:sz w:val="24"/>
+          <w:szCs w:val="24"/>
+        </w:rPr>
+        <w:t xml:space="preserve">RNF  </w:t>
+      </w:r>
+      <w:r>
+        <w:rPr>
+          <w:rFonts w:ascii="Times New Roman" w:hAnsi="Times New Roman" w:cs="Times New Roman"/>
+          <w:sz w:val="24"/>
+          <w:szCs w:val="24"/>
+        </w:rPr>
+        <w:t>8</w:t>
+      </w:r>
+      <w:r>
+        <w:rPr>
+          <w:rFonts w:ascii="Times New Roman" w:hAnsi="Times New Roman" w:cs="Times New Roman"/>
+          <w:sz w:val="24"/>
+          <w:szCs w:val="24"/>
+        </w:rPr>
+        <w:t xml:space="preserve"> – </w:t>
+      </w:r>
+      <w:r>
+        <w:rPr>
+          <w:rFonts w:ascii="Times New Roman" w:hAnsi="Times New Roman" w:cs="Times New Roman"/>
+          <w:sz w:val="24"/>
+          <w:szCs w:val="24"/>
+        </w:rPr>
+        <w:t>Organização do código</w:t>
+      </w:r>
+      <w:r>
+        <w:rPr>
+          <w:rFonts w:ascii="Times New Roman" w:hAnsi="Times New Roman" w:cs="Times New Roman"/>
+          <w:sz w:val="24"/>
+          <w:szCs w:val="24"/>
+        </w:rPr>
+        <w:t xml:space="preserve"> </w:t>
+      </w:r>
+    </w:p>
+    <w:p>
+      <w:pPr>
+        <w:rPr>
+          <w:rFonts w:ascii="Times New Roman" w:hAnsi="Times New Roman" w:cs="Times New Roman"/>
+          <w:sz w:val="24"/>
+          <w:szCs w:val="24"/>
+        </w:rPr>
+      </w:pPr>
+      <w:r>
+        <w:rPr>
+          <w:rFonts w:ascii="Times New Roman" w:hAnsi="Times New Roman" w:cs="Times New Roman"/>
+          <w:sz w:val="24"/>
+          <w:szCs w:val="24"/>
+        </w:rPr>
+        <w:t xml:space="preserve">Descrição: </w:t>
+      </w:r>
+      <w:r>
+        <w:rPr>
+          <w:rFonts w:ascii="Times New Roman" w:hAnsi="Times New Roman" w:cs="Times New Roman"/>
+          <w:sz w:val="24"/>
+          <w:szCs w:val="24"/>
+        </w:rPr>
+        <w:t>O código deve ser organizado e de fácil entendimento.</w:t>
+      </w:r>
+    </w:p>
+    <w:p>
+      <w:pPr>
+        <w:rPr>
+          <w:rFonts w:ascii="Times New Roman" w:hAnsi="Times New Roman" w:cs="Times New Roman"/>
+          <w:sz w:val="24"/>
+          <w:szCs w:val="24"/>
+          <w:lang w:eastAsia="pt-BR"/>
+        </w:rPr>
+      </w:pPr>
+    </w:p>
+    <w:p>
+      <w:pPr>
+        <w:pStyle w:val="Ttulo2"/>
         <w:rPr>
           <w:rFonts w:ascii="Times New Roman" w:hAnsi="Times New Roman" w:cs="Times New Roman"/>
           <w:b/>
@@ -634,9 +1248,29 @@
           <w:sz w:val="24"/>
           <w:szCs w:val="24"/>
         </w:rPr>
-        <w:t>Organizacional</w:t>
-      </w:r>
-      <w:bookmarkEnd w:id="5"/>
+      </w:pPr>
+      <w:bookmarkStart w:id="9" w:name="_Toc98916009"/>
+      <w:r>
+        <w:rPr>
+          <w:rFonts w:ascii="Times New Roman" w:hAnsi="Times New Roman" w:cs="Times New Roman"/>
+          <w:b/>
+          <w:color w:val="auto"/>
+          <w:sz w:val="24"/>
+          <w:szCs w:val="24"/>
+        </w:rPr>
+        <w:t xml:space="preserve">3. </w:t>
+      </w:r>
+      <w:r>
+        <w:rPr>
+          <w:rFonts w:ascii="Times New Roman" w:hAnsi="Times New Roman" w:cs="Times New Roman"/>
+          <w:b/>
+          <w:color w:val="auto"/>
+          <w:sz w:val="24"/>
+          <w:szCs w:val="24"/>
+        </w:rPr>
+        <w:t>Externo</w:t>
+      </w:r>
+      <w:bookmarkEnd w:id="9"/>
     </w:p>
     <w:p>
       <w:pPr>
@@ -657,15 +1291,90 @@
           <w:color w:val="auto"/>
         </w:rPr>
       </w:pPr>
-      <w:bookmarkStart w:id="7" w:name="_Toc98916006"/>
-      <w:r>
-        <w:rPr>
-          <w:rFonts w:ascii="Times New Roman" w:hAnsi="Times New Roman" w:cs="Times New Roman"/>
-          <w:color w:val="auto"/>
-        </w:rPr>
-        <w:t>2.1 Entrega</w:t>
-      </w:r>
-      <w:bookmarkEnd w:id="7"/>
+      <w:bookmarkStart w:id="10" w:name="_Toc98916010"/>
+      <w:r>
+        <w:rPr>
+          <w:rFonts w:ascii="Times New Roman" w:hAnsi="Times New Roman" w:cs="Times New Roman"/>
+          <w:color w:val="auto"/>
+        </w:rPr>
+        <w:t>3.1 Interoperabilidade</w:t>
+      </w:r>
+      <w:bookmarkEnd w:id="10"/>
+    </w:p>
+    <w:p>
+      <w:pPr>
+        <w:rPr>
+          <w:rFonts w:ascii="Times New Roman" w:hAnsi="Times New Roman" w:cs="Times New Roman"/>
+          <w:sz w:val="24"/>
+          <w:szCs w:val="24"/>
+        </w:rPr>
+      </w:pPr>
+    </w:p>
+    <w:p>
+      <w:pPr>
+        <w:rPr>
+          <w:rFonts w:ascii="Times New Roman" w:hAnsi="Times New Roman" w:cs="Times New Roman"/>
+          <w:sz w:val="24"/>
+          <w:szCs w:val="24"/>
+        </w:rPr>
+      </w:pPr>
+      <w:r>
+        <w:rPr>
+          <w:rFonts w:ascii="Times New Roman" w:hAnsi="Times New Roman" w:cs="Times New Roman"/>
+          <w:sz w:val="24"/>
+          <w:szCs w:val="24"/>
+        </w:rPr>
+        <w:t xml:space="preserve">RNF  </w:t>
+      </w:r>
+      <w:r>
+        <w:rPr>
+          <w:rFonts w:ascii="Times New Roman" w:hAnsi="Times New Roman" w:cs="Times New Roman"/>
+          <w:sz w:val="24"/>
+          <w:szCs w:val="24"/>
+        </w:rPr>
+        <w:t>9</w:t>
+      </w:r>
+      <w:r>
+        <w:rPr>
+          <w:rFonts w:ascii="Times New Roman" w:hAnsi="Times New Roman" w:cs="Times New Roman"/>
+          <w:sz w:val="24"/>
+          <w:szCs w:val="24"/>
+        </w:rPr>
+        <w:t xml:space="preserve"> – </w:t>
+      </w:r>
+      <w:r>
+        <w:rPr>
+          <w:rFonts w:ascii="Times New Roman" w:hAnsi="Times New Roman" w:cs="Times New Roman"/>
+          <w:sz w:val="24"/>
+          <w:szCs w:val="24"/>
+        </w:rPr>
+        <w:t>Possível integração futura</w:t>
+      </w:r>
+    </w:p>
+    <w:p>
+      <w:pPr>
+        <w:rPr>
+          <w:rFonts w:ascii="Times New Roman" w:hAnsi="Times New Roman" w:cs="Times New Roman"/>
+          <w:sz w:val="24"/>
+          <w:szCs w:val="24"/>
+        </w:rPr>
+      </w:pPr>
+      <w:r>
+        <w:rPr>
+          <w:rFonts w:ascii="Times New Roman" w:hAnsi="Times New Roman" w:cs="Times New Roman"/>
+          <w:sz w:val="24"/>
+          <w:szCs w:val="24"/>
+        </w:rPr>
+        <w:t xml:space="preserve">Descrição: </w:t>
+      </w:r>
+      <w:r>
+        <w:rPr>
+          <w:rFonts w:ascii="Times New Roman" w:hAnsi="Times New Roman" w:cs="Times New Roman"/>
+          <w:sz w:val="24"/>
+          <w:szCs w:val="24"/>
+        </w:rPr>
+        <w:t>O sistema pode permitir integração com outros sistemas no futuro.</w:t>
+      </w:r>
     </w:p>
     <w:p>
       <w:pPr>
@@ -684,27 +1393,91 @@
           <w:color w:val="auto"/>
         </w:rPr>
       </w:pPr>
-      <w:bookmarkStart w:id="8" w:name="_Toc98916007"/>
-      <w:r>
-        <w:rPr>
-          <w:rFonts w:ascii="Times New Roman" w:hAnsi="Times New Roman" w:cs="Times New Roman"/>
-          <w:color w:val="auto"/>
-        </w:rPr>
-        <w:lastRenderedPageBreak/>
-        <w:t>2.2 Implementação</w:t>
-      </w:r>
-      <w:bookmarkEnd w:id="8"/>
-    </w:p>
-    <w:p>
-      <w:pPr>
-        <w:pStyle w:val="Ttulo4"/>
-        <w:rPr>
-          <w:rFonts w:ascii="Times New Roman" w:hAnsi="Times New Roman" w:cs="Times New Roman"/>
-          <w:color w:val="auto"/>
-          <w:sz w:val="24"/>
-          <w:szCs w:val="24"/>
-        </w:rPr>
-      </w:pPr>
+      <w:bookmarkStart w:id="11" w:name="_Toc98916011"/>
+      <w:r>
+        <w:rPr>
+          <w:rFonts w:ascii="Times New Roman" w:hAnsi="Times New Roman" w:cs="Times New Roman"/>
+          <w:color w:val="auto"/>
+        </w:rPr>
+        <w:t>3.2 Legal</w:t>
+      </w:r>
+      <w:bookmarkEnd w:id="11"/>
+    </w:p>
+    <w:p>
+      <w:pPr>
+        <w:rPr>
+          <w:rFonts w:ascii="Times New Roman" w:hAnsi="Times New Roman" w:cs="Times New Roman"/>
+          <w:sz w:val="24"/>
+          <w:szCs w:val="24"/>
+          <w:lang w:eastAsia="pt-BR"/>
+        </w:rPr>
+      </w:pPr>
+    </w:p>
+    <w:p>
+      <w:pPr>
+        <w:rPr>
+          <w:rFonts w:ascii="Times New Roman" w:hAnsi="Times New Roman" w:cs="Times New Roman"/>
+          <w:sz w:val="24"/>
+          <w:szCs w:val="24"/>
+        </w:rPr>
+      </w:pPr>
+      <w:r>
+        <w:rPr>
+          <w:rFonts w:ascii="Times New Roman" w:hAnsi="Times New Roman" w:cs="Times New Roman"/>
+          <w:sz w:val="24"/>
+          <w:szCs w:val="24"/>
+        </w:rPr>
+        <w:t>RNF  1</w:t>
+      </w:r>
+      <w:r>
+        <w:rPr>
+          <w:rFonts w:ascii="Times New Roman" w:hAnsi="Times New Roman" w:cs="Times New Roman"/>
+          <w:sz w:val="24"/>
+          <w:szCs w:val="24"/>
+        </w:rPr>
+        <w:t>0</w:t>
+      </w:r>
+      <w:r>
+        <w:rPr>
+          <w:rFonts w:ascii="Times New Roman" w:hAnsi="Times New Roman" w:cs="Times New Roman"/>
+          <w:sz w:val="24"/>
+          <w:szCs w:val="24"/>
+        </w:rPr>
+        <w:t xml:space="preserve"> – </w:t>
+      </w:r>
+      <w:r>
+        <w:rPr>
+          <w:rFonts w:ascii="Times New Roman" w:hAnsi="Times New Roman" w:cs="Times New Roman"/>
+          <w:sz w:val="24"/>
+          <w:szCs w:val="24"/>
+        </w:rPr>
+        <w:t>Privacidade</w:t>
+      </w:r>
+    </w:p>
+    <w:p>
+      <w:pPr>
+        <w:rPr>
+          <w:rFonts w:ascii="Times New Roman" w:hAnsi="Times New Roman" w:cs="Times New Roman"/>
+          <w:sz w:val="24"/>
+          <w:szCs w:val="24"/>
+        </w:rPr>
+      </w:pPr>
+      <w:r>
+        <w:rPr>
+          <w:rFonts w:ascii="Times New Roman" w:hAnsi="Times New Roman" w:cs="Times New Roman"/>
+          <w:sz w:val="24"/>
+          <w:szCs w:val="24"/>
+        </w:rPr>
+        <w:t xml:space="preserve">Descrição: </w:t>
+      </w:r>
+      <w:r>
+        <w:rPr>
+          <w:rFonts w:ascii="Times New Roman" w:hAnsi="Times New Roman" w:cs="Times New Roman"/>
+          <w:sz w:val="24"/>
+          <w:szCs w:val="24"/>
+        </w:rPr>
+        <w:t>O sistema deve respeitar a privacidade dos dados dos usuários.</w:t>
+      </w:r>
     </w:p>
     <w:p>
       <w:pPr>
@@ -714,15 +1487,6 @@
           <w:color w:val="auto"/>
         </w:rPr>
       </w:pPr>
-      <w:bookmarkStart w:id="9" w:name="_Toc98916008"/>
-      <w:r>
-        <w:rPr>
-          <w:rFonts w:ascii="Times New Roman" w:hAnsi="Times New Roman" w:cs="Times New Roman"/>
-          <w:color w:val="auto"/>
-        </w:rPr>
-        <w:t>2.3 Padrão</w:t>
-      </w:r>
-      <w:bookmarkEnd w:id="9"/>
     </w:p>
     <w:p>
       <w:pPr>
@@ -732,98 +1496,15 @@
           <w:color w:val="auto"/>
         </w:rPr>
       </w:pPr>
-    </w:p>
-    <w:p>
-      <w:pPr>
-        <w:pStyle w:val="Ttulo2"/>
-        <w:rPr>
-          <w:rFonts w:ascii="Times New Roman" w:hAnsi="Times New Roman" w:cs="Times New Roman"/>
-          <w:b/>
-          <w:color w:val="auto"/>
-          <w:sz w:val="24"/>
-          <w:szCs w:val="24"/>
-        </w:rPr>
-      </w:pPr>
-      <w:bookmarkStart w:id="10" w:name="_Toc98916009"/>
-      <w:r>
-        <w:rPr>
-          <w:rFonts w:ascii="Times New Roman" w:hAnsi="Times New Roman" w:cs="Times New Roman"/>
-          <w:b/>
-          <w:color w:val="auto"/>
-          <w:sz w:val="24"/>
-          <w:szCs w:val="24"/>
-        </w:rPr>
-        <w:t xml:space="preserve">3. </w:t>
-      </w:r>
-      <w:r>
-        <w:rPr>
-          <w:rFonts w:ascii="Times New Roman" w:hAnsi="Times New Roman" w:cs="Times New Roman"/>
-          <w:b/>
-          <w:color w:val="auto"/>
-          <w:sz w:val="24"/>
-          <w:szCs w:val="24"/>
-        </w:rPr>
-        <w:t>Externo</w:t>
-      </w:r>
-      <w:bookmarkEnd w:id="10"/>
-    </w:p>
-    <w:p>
-      <w:pPr>
-        <w:pStyle w:val="Ttulo4"/>
-        <w:rPr>
-          <w:rFonts w:ascii="Times New Roman" w:hAnsi="Times New Roman" w:cs="Times New Roman"/>
-          <w:color w:val="auto"/>
-          <w:sz w:val="24"/>
-          <w:szCs w:val="24"/>
-        </w:rPr>
-      </w:pPr>
-    </w:p>
-    <w:p>
-      <w:pPr>
-        <w:pStyle w:val="Ttulo3"/>
-        <w:rPr>
-          <w:rFonts w:ascii="Times New Roman" w:hAnsi="Times New Roman" w:cs="Times New Roman"/>
-          <w:color w:val="auto"/>
-        </w:rPr>
-      </w:pPr>
-      <w:bookmarkStart w:id="11" w:name="_Toc98916010"/>
-      <w:r>
-        <w:rPr>
-          <w:rFonts w:ascii="Times New Roman" w:hAnsi="Times New Roman" w:cs="Times New Roman"/>
-          <w:color w:val="auto"/>
-        </w:rPr>
-        <w:t>3.1 Interoperabilidade</w:t>
-      </w:r>
-      <w:bookmarkEnd w:id="11"/>
-    </w:p>
-    <w:p>
-      <w:pPr>
-        <w:rPr>
-          <w:rFonts w:ascii="Times New Roman" w:hAnsi="Times New Roman" w:cs="Times New Roman"/>
-          <w:sz w:val="24"/>
-          <w:szCs w:val="24"/>
-        </w:rPr>
-      </w:pPr>
-    </w:p>
-    <w:p>
-      <w:pPr>
-        <w:pStyle w:val="Ttulo3"/>
-        <w:rPr>
-          <w:rFonts w:ascii="Times New Roman" w:hAnsi="Times New Roman" w:cs="Times New Roman"/>
-          <w:color w:val="auto"/>
-        </w:rPr>
-      </w:pPr>
-      <w:bookmarkStart w:id="12" w:name="_Toc98916011"/>
-      <w:proofErr w:type="gramStart"/>
-      <w:r>
-        <w:rPr>
-          <w:rFonts w:ascii="Times New Roman" w:hAnsi="Times New Roman" w:cs="Times New Roman"/>
-          <w:color w:val="auto"/>
-        </w:rPr>
-        <w:t>3.2 Legal</w:t>
+      <w:bookmarkStart w:id="12" w:name="_Toc98916012"/>
+      <w:r>
+        <w:rPr>
+          <w:rFonts w:ascii="Times New Roman" w:hAnsi="Times New Roman" w:cs="Times New Roman"/>
+          <w:color w:val="auto"/>
+        </w:rPr>
+        <w:t>3.3 Ético</w:t>
       </w:r>
       <w:bookmarkEnd w:id="12"/>
-      <w:proofErr w:type="gramEnd"/>
     </w:p>
     <w:p>
       <w:pPr>
@@ -837,32 +1518,69 @@
     </w:p>
     <w:p>
       <w:pPr>
-        <w:pStyle w:val="Ttulo3"/>
-        <w:rPr>
-          <w:rFonts w:ascii="Times New Roman" w:hAnsi="Times New Roman" w:cs="Times New Roman"/>
-          <w:color w:val="auto"/>
-        </w:rPr>
-      </w:pPr>
-    </w:p>
-    <w:p>
-      <w:pPr>
-        <w:pStyle w:val="Ttulo3"/>
-        <w:rPr>
-          <w:rFonts w:ascii="Times New Roman" w:hAnsi="Times New Roman" w:cs="Times New Roman"/>
-          <w:color w:val="auto"/>
-        </w:rPr>
-      </w:pPr>
-      <w:bookmarkStart w:id="13" w:name="_Toc98916012"/>
-      <w:proofErr w:type="gramStart"/>
-      <w:r>
-        <w:rPr>
-          <w:rFonts w:ascii="Times New Roman" w:hAnsi="Times New Roman" w:cs="Times New Roman"/>
-          <w:color w:val="auto"/>
-        </w:rPr>
-        <w:t>3.3 Ético</w:t>
-      </w:r>
-      <w:bookmarkEnd w:id="13"/>
-      <w:proofErr w:type="gramEnd"/>
+        <w:rPr>
+          <w:rFonts w:ascii="Times New Roman" w:hAnsi="Times New Roman" w:cs="Times New Roman"/>
+          <w:sz w:val="24"/>
+          <w:szCs w:val="24"/>
+        </w:rPr>
+      </w:pPr>
+      <w:r>
+        <w:rPr>
+          <w:rFonts w:ascii="Times New Roman" w:hAnsi="Times New Roman" w:cs="Times New Roman"/>
+          <w:sz w:val="24"/>
+          <w:szCs w:val="24"/>
+        </w:rPr>
+        <w:t>RNF  1</w:t>
+      </w:r>
+      <w:r>
+        <w:rPr>
+          <w:rFonts w:ascii="Times New Roman" w:hAnsi="Times New Roman" w:cs="Times New Roman"/>
+          <w:sz w:val="24"/>
+          <w:szCs w:val="24"/>
+        </w:rPr>
+        <w:t>1</w:t>
+      </w:r>
+      <w:r>
+        <w:rPr>
+          <w:rFonts w:ascii="Times New Roman" w:hAnsi="Times New Roman" w:cs="Times New Roman"/>
+          <w:sz w:val="24"/>
+          <w:szCs w:val="24"/>
+        </w:rPr>
+        <w:t xml:space="preserve"> – </w:t>
+      </w:r>
+      <w:r>
+        <w:rPr>
+          <w:rFonts w:ascii="Times New Roman" w:hAnsi="Times New Roman" w:cs="Times New Roman"/>
+          <w:sz w:val="24"/>
+          <w:szCs w:val="24"/>
+        </w:rPr>
+        <w:t>Uso adequado</w:t>
+      </w:r>
+    </w:p>
+    <w:p>
+      <w:pPr>
+        <w:rPr>
+          <w:rFonts w:ascii="Times New Roman" w:hAnsi="Times New Roman" w:cs="Times New Roman"/>
+          <w:sz w:val="24"/>
+          <w:szCs w:val="24"/>
+        </w:rPr>
+      </w:pPr>
+      <w:r>
+        <w:rPr>
+          <w:rFonts w:ascii="Times New Roman" w:hAnsi="Times New Roman" w:cs="Times New Roman"/>
+          <w:sz w:val="24"/>
+          <w:szCs w:val="24"/>
+        </w:rPr>
+        <w:t xml:space="preserve">Descrição: </w:t>
+      </w:r>
+      <w:r>
+        <w:rPr>
+          <w:rFonts w:ascii="Times New Roman" w:hAnsi="Times New Roman" w:cs="Times New Roman"/>
+          <w:sz w:val="24"/>
+          <w:szCs w:val="24"/>
+        </w:rPr>
+        <w:t>O sistema deve ser utilizado de forma correta, sem prejudicar os usuários.</w:t>
+      </w:r>
     </w:p>
     <w:p>
       <w:pPr>
@@ -943,26 +1661,19 @@
     </w:p>
     <w:p>
       <w:pPr>
+        <w:jc w:val="center"/>
         <w:rPr>
           <w:lang w:eastAsia="pt-BR"/>
         </w:rPr>
       </w:pPr>
     </w:p>
-    <w:p>
-      <w:pPr>
-        <w:jc w:val="center"/>
-        <w:rPr>
-          <w:lang w:eastAsia="pt-BR"/>
-        </w:rPr>
-      </w:pPr>
-    </w:p>
     <w:sectPr>
-      <w:headerReference w:type="even" r:id="rId6"/>
-      <w:headerReference w:type="default" r:id="rId7"/>
-      <w:footerReference w:type="even" r:id="rId8"/>
-      <w:footerReference w:type="default" r:id="rId9"/>
-      <w:headerReference w:type="first" r:id="rId10"/>
-      <w:footerReference w:type="first" r:id="rId11"/>
+      <w:headerReference w:type="even" r:id="rId7"/>
+      <w:headerReference w:type="default" r:id="rId8"/>
+      <w:footerReference w:type="even" r:id="rId9"/>
+      <w:footerReference w:type="default" r:id="rId10"/>
+      <w:headerReference w:type="first" r:id="rId11"/>
+      <w:footerReference w:type="first" r:id="rId12"/>
       <w:pgSz w:w="11906" w:h="16838"/>
       <w:pgMar w:top="1417" w:right="1701" w:bottom="1417" w:left="1701" w:header="708" w:footer="708" w:gutter="0"/>
       <w:cols w:space="708"/>
@@ -973,7 +1684,7 @@
 </file>
 
 <file path=word/endnotes.xml><?xml version="1.0" encoding="utf-8"?>
-<w:endnotes xmlns:wpc="http://schemas.microsoft.com/office/word/2010/wordprocessingCanvas" xmlns:cx="http://schemas.microsoft.com/office/drawing/2014/chartex" xmlns:cx1="http://schemas.microsoft.com/office/drawing/2015/9/8/chartex" xmlns:mc="http://schemas.openxmlformats.org/markup-compatibility/2006" xmlns:o="urn:schemas-microsoft-com:office:office" xmlns:r="http://schemas.openxmlformats.org/officeDocument/2006/relationships" xmlns:m="http://schemas.openxmlformats.org/officeDocument/2006/math" xmlns:v="urn:schemas-microsoft-com:vml" xmlns:wp14="http://schemas.microsoft.com/office/word/2010/wordprocessingDrawing" xmlns:wp="http://schemas.openxmlformats.org/drawingml/2006/wordprocessingDrawing" xmlns:w10="urn:schemas-microsoft-com:office:word" xmlns:w="http://schemas.openxmlformats.org/wordprocessingml/2006/main" xmlns:w14="http://schemas.microsoft.com/office/word/2010/wordml" xmlns:w15="http://schemas.microsoft.com/office/word/2012/wordml" xmlns:w16se="http://schemas.microsoft.com/office/word/2015/wordml/symex" xmlns:wpg="http://schemas.microsoft.com/office/word/2010/wordprocessingGroup" xmlns:wpi="http://schemas.microsoft.com/office/word/2010/wordprocessingInk" xmlns:wne="http://schemas.microsoft.com/office/word/2006/wordml" xmlns:wps="http://schemas.microsoft.com/office/word/2010/wordprocessingShape" mc:Ignorable="w14 w15 w16se wp14">
+<w:endnotes xmlns:wpc="http://schemas.microsoft.com/office/word/2010/wordprocessingCanvas" xmlns:cx="http://schemas.microsoft.com/office/drawing/2014/chartex" xmlns:cx1="http://schemas.microsoft.com/office/drawing/2015/9/8/chartex" xmlns:cx2="http://schemas.microsoft.com/office/drawing/2015/10/21/chartex" xmlns:cx3="http://schemas.microsoft.com/office/drawing/2016/5/9/chartex" xmlns:cx4="http://schemas.microsoft.com/office/drawing/2016/5/10/chartex" xmlns:cx5="http://schemas.microsoft.com/office/drawing/2016/5/11/chartex" xmlns:cx6="http://schemas.microsoft.com/office/drawing/2016/5/12/chartex" xmlns:cx7="http://schemas.microsoft.com/office/drawing/2016/5/13/chartex" xmlns:cx8="http://schemas.microsoft.com/office/drawing/2016/5/14/chartex" xmlns:mc="http://schemas.openxmlformats.org/markup-compatibility/2006" xmlns:aink="http://schemas.microsoft.com/office/drawing/2016/ink" xmlns:am3d="http://schemas.microsoft.com/office/drawing/2017/model3d" xmlns:o="urn:schemas-microsoft-com:office:office" xmlns:oel="http://schemas.microsoft.com/office/2019/extlst" xmlns:r="http://schemas.openxmlformats.org/officeDocument/2006/relationships" xmlns:m="http://schemas.openxmlformats.org/officeDocument/2006/math" xmlns:v="urn:schemas-microsoft-com:vml" xmlns:wp14="http://schemas.microsoft.com/office/word/2010/wordprocessingDrawing" xmlns:wp="http://schemas.openxmlformats.org/drawingml/2006/wordprocessingDrawing" xmlns:w10="urn:schemas-microsoft-com:office:word" xmlns:w="http://schemas.openxmlformats.org/wordprocessingml/2006/main" xmlns:w14="http://schemas.microsoft.com/office/word/2010/wordml" xmlns:w15="http://schemas.microsoft.com/office/word/2012/wordml" xmlns:w16cex="http://schemas.microsoft.com/office/word/2018/wordml/cex" xmlns:w16cid="http://schemas.microsoft.com/office/word/2016/wordml/cid" xmlns:w16="http://schemas.microsoft.com/office/word/2018/wordml" xmlns:w16du="http://schemas.microsoft.com/office/word/2023/wordml/word16du" xmlns:w16sdtdh="http://schemas.microsoft.com/office/word/2020/wordml/sdtdatahash" xmlns:w16sdtfl="http://schemas.microsoft.com/office/word/2024/wordml/sdtformatlock" xmlns:w16se="http://schemas.microsoft.com/office/word/2015/wordml/symex" xmlns:wpg="http://schemas.microsoft.com/office/word/2010/wordprocessingGroup" xmlns:wpi="http://schemas.microsoft.com/office/word/2010/wordprocessingInk" xmlns:wne="http://schemas.microsoft.com/office/word/2006/wordml" xmlns:wps="http://schemas.microsoft.com/office/word/2010/wordprocessingShape" mc:Ignorable="w14 w15 w16se w16cid w16 w16cex w16sdtdh w16sdtfl w16du wp14">
   <w:endnote w:type="separator" w:id="-1">
     <w:p>
       <w:pPr>
@@ -998,7 +1709,7 @@
 </file>
 
 <file path=word/footer1.xml><?xml version="1.0" encoding="utf-8"?>
-<w:ftr xmlns:wpc="http://schemas.microsoft.com/office/word/2010/wordprocessingCanvas" xmlns:cx="http://schemas.microsoft.com/office/drawing/2014/chartex" xmlns:cx1="http://schemas.microsoft.com/office/drawing/2015/9/8/chartex" xmlns:mc="http://schemas.openxmlformats.org/markup-compatibility/2006" xmlns:o="urn:schemas-microsoft-com:office:office" xmlns:r="http://schemas.openxmlformats.org/officeDocument/2006/relationships" xmlns:m="http://schemas.openxmlformats.org/officeDocument/2006/math" xmlns:v="urn:schemas-microsoft-com:vml" xmlns:wp14="http://schemas.microsoft.com/office/word/2010/wordprocessingDrawing" xmlns:wp="http://schemas.openxmlformats.org/drawingml/2006/wordprocessingDrawing" xmlns:w10="urn:schemas-microsoft-com:office:word" xmlns:w="http://schemas.openxmlformats.org/wordprocessingml/2006/main" xmlns:w14="http://schemas.microsoft.com/office/word/2010/wordml" xmlns:w15="http://schemas.microsoft.com/office/word/2012/wordml" xmlns:w16se="http://schemas.microsoft.com/office/word/2015/wordml/symex" xmlns:wpg="http://schemas.microsoft.com/office/word/2010/wordprocessingGroup" xmlns:wpi="http://schemas.microsoft.com/office/word/2010/wordprocessingInk" xmlns:wne="http://schemas.microsoft.com/office/word/2006/wordml" xmlns:wps="http://schemas.microsoft.com/office/word/2010/wordprocessingShape" mc:Ignorable="w14 w15 w16se wp14">
+<w:ftr xmlns:wpc="http://schemas.microsoft.com/office/word/2010/wordprocessingCanvas" xmlns:cx="http://schemas.microsoft.com/office/drawing/2014/chartex" xmlns:cx1="http://schemas.microsoft.com/office/drawing/2015/9/8/chartex" xmlns:cx2="http://schemas.microsoft.com/office/drawing/2015/10/21/chartex" xmlns:cx3="http://schemas.microsoft.com/office/drawing/2016/5/9/chartex" xmlns:cx4="http://schemas.microsoft.com/office/drawing/2016/5/10/chartex" xmlns:cx5="http://schemas.microsoft.com/office/drawing/2016/5/11/chartex" xmlns:cx6="http://schemas.microsoft.com/office/drawing/2016/5/12/chartex" xmlns:cx7="http://schemas.microsoft.com/office/drawing/2016/5/13/chartex" xmlns:cx8="http://schemas.microsoft.com/office/drawing/2016/5/14/chartex" xmlns:mc="http://schemas.openxmlformats.org/markup-compatibility/2006" xmlns:aink="http://schemas.microsoft.com/office/drawing/2016/ink" xmlns:am3d="http://schemas.microsoft.com/office/drawing/2017/model3d" xmlns:o="urn:schemas-microsoft-com:office:office" xmlns:oel="http://schemas.microsoft.com/office/2019/extlst" xmlns:r="http://schemas.openxmlformats.org/officeDocument/2006/relationships" xmlns:m="http://schemas.openxmlformats.org/officeDocument/2006/math" xmlns:v="urn:schemas-microsoft-com:vml" xmlns:wp14="http://schemas.microsoft.com/office/word/2010/wordprocessingDrawing" xmlns:wp="http://schemas.openxmlformats.org/drawingml/2006/wordprocessingDrawing" xmlns:w10="urn:schemas-microsoft-com:office:word" xmlns:w="http://schemas.openxmlformats.org/wordprocessingml/2006/main" xmlns:w14="http://schemas.microsoft.com/office/word/2010/wordml" xmlns:w15="http://schemas.microsoft.com/office/word/2012/wordml" xmlns:w16cex="http://schemas.microsoft.com/office/word/2018/wordml/cex" xmlns:w16cid="http://schemas.microsoft.com/office/word/2016/wordml/cid" xmlns:w16="http://schemas.microsoft.com/office/word/2018/wordml" xmlns:w16du="http://schemas.microsoft.com/office/word/2023/wordml/word16du" xmlns:w16sdtdh="http://schemas.microsoft.com/office/word/2020/wordml/sdtdatahash" xmlns:w16sdtfl="http://schemas.microsoft.com/office/word/2024/wordml/sdtformatlock" xmlns:w16se="http://schemas.microsoft.com/office/word/2015/wordml/symex" xmlns:wpg="http://schemas.microsoft.com/office/word/2010/wordprocessingGroup" xmlns:wpi="http://schemas.microsoft.com/office/word/2010/wordprocessingInk" xmlns:wne="http://schemas.microsoft.com/office/word/2006/wordml" xmlns:wps="http://schemas.microsoft.com/office/word/2010/wordprocessingShape" mc:Ignorable="w14 w15 w16se w16cid w16 w16cex w16sdtdh w16sdtfl w16du wp14">
   <w:p>
     <w:pPr>
       <w:pStyle w:val="Rodap"/>
@@ -1008,7 +1719,7 @@
 </file>
 
 <file path=word/footer2.xml><?xml version="1.0" encoding="utf-8"?>
-<w:ftr xmlns:wpc="http://schemas.microsoft.com/office/word/2010/wordprocessingCanvas" xmlns:cx="http://schemas.microsoft.com/office/drawing/2014/chartex" xmlns:cx1="http://schemas.microsoft.com/office/drawing/2015/9/8/chartex" xmlns:mc="http://schemas.openxmlformats.org/markup-compatibility/2006" xmlns:o="urn:schemas-microsoft-com:office:office" xmlns:r="http://schemas.openxmlformats.org/officeDocument/2006/relationships" xmlns:m="http://schemas.openxmlformats.org/officeDocument/2006/math" xmlns:v="urn:schemas-microsoft-com:vml" xmlns:wp14="http://schemas.microsoft.com/office/word/2010/wordprocessingDrawing" xmlns:wp="http://schemas.openxmlformats.org/drawingml/2006/wordprocessingDrawing" xmlns:w10="urn:schemas-microsoft-com:office:word" xmlns:w="http://schemas.openxmlformats.org/wordprocessingml/2006/main" xmlns:w14="http://schemas.microsoft.com/office/word/2010/wordml" xmlns:w15="http://schemas.microsoft.com/office/word/2012/wordml" xmlns:w16se="http://schemas.microsoft.com/office/word/2015/wordml/symex" xmlns:wpg="http://schemas.microsoft.com/office/word/2010/wordprocessingGroup" xmlns:wpi="http://schemas.microsoft.com/office/word/2010/wordprocessingInk" xmlns:wne="http://schemas.microsoft.com/office/word/2006/wordml" xmlns:wps="http://schemas.microsoft.com/office/word/2010/wordprocessingShape" mc:Ignorable="w14 w15 w16se wp14">
+<w:ftr xmlns:wpc="http://schemas.microsoft.com/office/word/2010/wordprocessingCanvas" xmlns:cx="http://schemas.microsoft.com/office/drawing/2014/chartex" xmlns:cx1="http://schemas.microsoft.com/office/drawing/2015/9/8/chartex" xmlns:cx2="http://schemas.microsoft.com/office/drawing/2015/10/21/chartex" xmlns:cx3="http://schemas.microsoft.com/office/drawing/2016/5/9/chartex" xmlns:cx4="http://schemas.microsoft.com/office/drawing/2016/5/10/chartex" xmlns:cx5="http://schemas.microsoft.com/office/drawing/2016/5/11/chartex" xmlns:cx6="http://schemas.microsoft.com/office/drawing/2016/5/12/chartex" xmlns:cx7="http://schemas.microsoft.com/office/drawing/2016/5/13/chartex" xmlns:cx8="http://schemas.microsoft.com/office/drawing/2016/5/14/chartex" xmlns:mc="http://schemas.openxmlformats.org/markup-compatibility/2006" xmlns:aink="http://schemas.microsoft.com/office/drawing/2016/ink" xmlns:am3d="http://schemas.microsoft.com/office/drawing/2017/model3d" xmlns:o="urn:schemas-microsoft-com:office:office" xmlns:oel="http://schemas.microsoft.com/office/2019/extlst" xmlns:r="http://schemas.openxmlformats.org/officeDocument/2006/relationships" xmlns:m="http://schemas.openxmlformats.org/officeDocument/2006/math" xmlns:v="urn:schemas-microsoft-com:vml" xmlns:wp14="http://schemas.microsoft.com/office/word/2010/wordprocessingDrawing" xmlns:wp="http://schemas.openxmlformats.org/drawingml/2006/wordprocessingDrawing" xmlns:w10="urn:schemas-microsoft-com:office:word" xmlns:w="http://schemas.openxmlformats.org/wordprocessingml/2006/main" xmlns:w14="http://schemas.microsoft.com/office/word/2010/wordml" xmlns:w15="http://schemas.microsoft.com/office/word/2012/wordml" xmlns:w16cex="http://schemas.microsoft.com/office/word/2018/wordml/cex" xmlns:w16cid="http://schemas.microsoft.com/office/word/2016/wordml/cid" xmlns:w16="http://schemas.microsoft.com/office/word/2018/wordml" xmlns:w16du="http://schemas.microsoft.com/office/word/2023/wordml/word16du" xmlns:w16sdtdh="http://schemas.microsoft.com/office/word/2020/wordml/sdtdatahash" xmlns:w16sdtfl="http://schemas.microsoft.com/office/word/2024/wordml/sdtformatlock" xmlns:w16se="http://schemas.microsoft.com/office/word/2015/wordml/symex" xmlns:wpg="http://schemas.microsoft.com/office/word/2010/wordprocessingGroup" xmlns:wpi="http://schemas.microsoft.com/office/word/2010/wordprocessingInk" xmlns:wne="http://schemas.microsoft.com/office/word/2006/wordml" xmlns:wps="http://schemas.microsoft.com/office/word/2010/wordprocessingShape" mc:Ignorable="w14 w15 w16se w16cid w16 w16cex w16sdtdh w16sdtfl w16du wp14">
   <w:p>
     <w:pPr>
       <w:pStyle w:val="Rodap"/>
@@ -1122,7 +1833,7 @@
 </file>
 
 <file path=word/footer3.xml><?xml version="1.0" encoding="utf-8"?>
-<w:ftr xmlns:wpc="http://schemas.microsoft.com/office/word/2010/wordprocessingCanvas" xmlns:cx="http://schemas.microsoft.com/office/drawing/2014/chartex" xmlns:cx1="http://schemas.microsoft.com/office/drawing/2015/9/8/chartex" xmlns:mc="http://schemas.openxmlformats.org/markup-compatibility/2006" xmlns:o="urn:schemas-microsoft-com:office:office" xmlns:r="http://schemas.openxmlformats.org/officeDocument/2006/relationships" xmlns:m="http://schemas.openxmlformats.org/officeDocument/2006/math" xmlns:v="urn:schemas-microsoft-com:vml" xmlns:wp14="http://schemas.microsoft.com/office/word/2010/wordprocessingDrawing" xmlns:wp="http://schemas.openxmlformats.org/drawingml/2006/wordprocessingDrawing" xmlns:w10="urn:schemas-microsoft-com:office:word" xmlns:w="http://schemas.openxmlformats.org/wordprocessingml/2006/main" xmlns:w14="http://schemas.microsoft.com/office/word/2010/wordml" xmlns:w15="http://schemas.microsoft.com/office/word/2012/wordml" xmlns:w16se="http://schemas.microsoft.com/office/word/2015/wordml/symex" xmlns:wpg="http://schemas.microsoft.com/office/word/2010/wordprocessingGroup" xmlns:wpi="http://schemas.microsoft.com/office/word/2010/wordprocessingInk" xmlns:wne="http://schemas.microsoft.com/office/word/2006/wordml" xmlns:wps="http://schemas.microsoft.com/office/word/2010/wordprocessingShape" mc:Ignorable="w14 w15 w16se wp14">
+<w:ftr xmlns:wpc="http://schemas.microsoft.com/office/word/2010/wordprocessingCanvas" xmlns:cx="http://schemas.microsoft.com/office/drawing/2014/chartex" xmlns:cx1="http://schemas.microsoft.com/office/drawing/2015/9/8/chartex" xmlns:cx2="http://schemas.microsoft.com/office/drawing/2015/10/21/chartex" xmlns:cx3="http://schemas.microsoft.com/office/drawing/2016/5/9/chartex" xmlns:cx4="http://schemas.microsoft.com/office/drawing/2016/5/10/chartex" xmlns:cx5="http://schemas.microsoft.com/office/drawing/2016/5/11/chartex" xmlns:cx6="http://schemas.microsoft.com/office/drawing/2016/5/12/chartex" xmlns:cx7="http://schemas.microsoft.com/office/drawing/2016/5/13/chartex" xmlns:cx8="http://schemas.microsoft.com/office/drawing/2016/5/14/chartex" xmlns:mc="http://schemas.openxmlformats.org/markup-compatibility/2006" xmlns:aink="http://schemas.microsoft.com/office/drawing/2016/ink" xmlns:am3d="http://schemas.microsoft.com/office/drawing/2017/model3d" xmlns:o="urn:schemas-microsoft-com:office:office" xmlns:oel="http://schemas.microsoft.com/office/2019/extlst" xmlns:r="http://schemas.openxmlformats.org/officeDocument/2006/relationships" xmlns:m="http://schemas.openxmlformats.org/officeDocument/2006/math" xmlns:v="urn:schemas-microsoft-com:vml" xmlns:wp14="http://schemas.microsoft.com/office/word/2010/wordprocessingDrawing" xmlns:wp="http://schemas.openxmlformats.org/drawingml/2006/wordprocessingDrawing" xmlns:w10="urn:schemas-microsoft-com:office:word" xmlns:w="http://schemas.openxmlformats.org/wordprocessingml/2006/main" xmlns:w14="http://schemas.microsoft.com/office/word/2010/wordml" xmlns:w15="http://schemas.microsoft.com/office/word/2012/wordml" xmlns:w16cex="http://schemas.microsoft.com/office/word/2018/wordml/cex" xmlns:w16cid="http://schemas.microsoft.com/office/word/2016/wordml/cid" xmlns:w16="http://schemas.microsoft.com/office/word/2018/wordml" xmlns:w16du="http://schemas.microsoft.com/office/word/2023/wordml/word16du" xmlns:w16sdtdh="http://schemas.microsoft.com/office/word/2020/wordml/sdtdatahash" xmlns:w16sdtfl="http://schemas.microsoft.com/office/word/2024/wordml/sdtformatlock" xmlns:w16se="http://schemas.microsoft.com/office/word/2015/wordml/symex" xmlns:wpg="http://schemas.microsoft.com/office/word/2010/wordprocessingGroup" xmlns:wpi="http://schemas.microsoft.com/office/word/2010/wordprocessingInk" xmlns:wne="http://schemas.microsoft.com/office/word/2006/wordml" xmlns:wps="http://schemas.microsoft.com/office/word/2010/wordprocessingShape" mc:Ignorable="w14 w15 w16se w16cid w16 w16cex w16sdtdh w16sdtfl w16du wp14">
   <w:p>
     <w:pPr>
       <w:pStyle w:val="Rodap"/>
@@ -1132,7 +1843,7 @@
 </file>
 
 <file path=word/footnotes.xml><?xml version="1.0" encoding="utf-8"?>
-<w:footnotes xmlns:wpc="http://schemas.microsoft.com/office/word/2010/wordprocessingCanvas" xmlns:cx="http://schemas.microsoft.com/office/drawing/2014/chartex" xmlns:cx1="http://schemas.microsoft.com/office/drawing/2015/9/8/chartex" xmlns:mc="http://schemas.openxmlformats.org/markup-compatibility/2006" xmlns:o="urn:schemas-microsoft-com:office:office" xmlns:r="http://schemas.openxmlformats.org/officeDocument/2006/relationships" xmlns:m="http://schemas.openxmlformats.org/officeDocument/2006/math" xmlns:v="urn:schemas-microsoft-com:vml" xmlns:wp14="http://schemas.microsoft.com/office/word/2010/wordprocessingDrawing" xmlns:wp="http://schemas.openxmlformats.org/drawingml/2006/wordprocessingDrawing" xmlns:w10="urn:schemas-microsoft-com:office:word" xmlns:w="http://schemas.openxmlformats.org/wordprocessingml/2006/main" xmlns:w14="http://schemas.microsoft.com/office/word/2010/wordml" xmlns:w15="http://schemas.microsoft.com/office/word/2012/wordml" xmlns:w16se="http://schemas.microsoft.com/office/word/2015/wordml/symex" xmlns:wpg="http://schemas.microsoft.com/office/word/2010/wordprocessingGroup" xmlns:wpi="http://schemas.microsoft.com/office/word/2010/wordprocessingInk" xmlns:wne="http://schemas.microsoft.com/office/word/2006/wordml" xmlns:wps="http://schemas.microsoft.com/office/word/2010/wordprocessingShape" mc:Ignorable="w14 w15 w16se wp14">
+<w:footnotes xmlns:wpc="http://schemas.microsoft.com/office/word/2010/wordprocessingCanvas" xmlns:cx="http://schemas.microsoft.com/office/drawing/2014/chartex" xmlns:cx1="http://schemas.microsoft.com/office/drawing/2015/9/8/chartex" xmlns:cx2="http://schemas.microsoft.com/office/drawing/2015/10/21/chartex" xmlns:cx3="http://schemas.microsoft.com/office/drawing/2016/5/9/chartex" xmlns:cx4="http://schemas.microsoft.com/office/drawing/2016/5/10/chartex" xmlns:cx5="http://schemas.microsoft.com/office/drawing/2016/5/11/chartex" xmlns:cx6="http://schemas.microsoft.com/office/drawing/2016/5/12/chartex" xmlns:cx7="http://schemas.microsoft.com/office/drawing/2016/5/13/chartex" xmlns:cx8="http://schemas.microsoft.com/office/drawing/2016/5/14/chartex" xmlns:mc="http://schemas.openxmlformats.org/markup-compatibility/2006" xmlns:aink="http://schemas.microsoft.com/office/drawing/2016/ink" xmlns:am3d="http://schemas.microsoft.com/office/drawing/2017/model3d" xmlns:o="urn:schemas-microsoft-com:office:office" xmlns:oel="http://schemas.microsoft.com/office/2019/extlst" xmlns:r="http://schemas.openxmlformats.org/officeDocument/2006/relationships" xmlns:m="http://schemas.openxmlformats.org/officeDocument/2006/math" xmlns:v="urn:schemas-microsoft-com:vml" xmlns:wp14="http://schemas.microsoft.com/office/word/2010/wordprocessingDrawing" xmlns:wp="http://schemas.openxmlformats.org/drawingml/2006/wordprocessingDrawing" xmlns:w10="urn:schemas-microsoft-com:office:word" xmlns:w="http://schemas.openxmlformats.org/wordprocessingml/2006/main" xmlns:w14="http://schemas.microsoft.com/office/word/2010/wordml" xmlns:w15="http://schemas.microsoft.com/office/word/2012/wordml" xmlns:w16cex="http://schemas.microsoft.com/office/word/2018/wordml/cex" xmlns:w16cid="http://schemas.microsoft.com/office/word/2016/wordml/cid" xmlns:w16="http://schemas.microsoft.com/office/word/2018/wordml" xmlns:w16du="http://schemas.microsoft.com/office/word/2023/wordml/word16du" xmlns:w16sdtdh="http://schemas.microsoft.com/office/word/2020/wordml/sdtdatahash" xmlns:w16sdtfl="http://schemas.microsoft.com/office/word/2024/wordml/sdtformatlock" xmlns:w16se="http://schemas.microsoft.com/office/word/2015/wordml/symex" xmlns:wpg="http://schemas.microsoft.com/office/word/2010/wordprocessingGroup" xmlns:wpi="http://schemas.microsoft.com/office/word/2010/wordprocessingInk" xmlns:wne="http://schemas.microsoft.com/office/word/2006/wordml" xmlns:wps="http://schemas.microsoft.com/office/word/2010/wordprocessingShape" mc:Ignorable="w14 w15 w16se w16cid w16 w16cex w16sdtdh w16sdtfl w16du wp14">
   <w:footnote w:type="separator" w:id="-1">
     <w:p>
       <w:pPr>
@@ -1157,7 +1868,7 @@
 </file>
 
 <file path=word/header1.xml><?xml version="1.0" encoding="utf-8"?>
-<w:hdr xmlns:wpc="http://schemas.microsoft.com/office/word/2010/wordprocessingCanvas" xmlns:cx="http://schemas.microsoft.com/office/drawing/2014/chartex" xmlns:cx1="http://schemas.microsoft.com/office/drawing/2015/9/8/chartex" xmlns:mc="http://schemas.openxmlformats.org/markup-compatibility/2006" xmlns:o="urn:schemas-microsoft-com:office:office" xmlns:r="http://schemas.openxmlformats.org/officeDocument/2006/relationships" xmlns:m="http://schemas.openxmlformats.org/officeDocument/2006/math" xmlns:v="urn:schemas-microsoft-com:vml" xmlns:wp14="http://schemas.microsoft.com/office/word/2010/wordprocessingDrawing" xmlns:wp="http://schemas.openxmlformats.org/drawingml/2006/wordprocessingDrawing" xmlns:w10="urn:schemas-microsoft-com:office:word" xmlns:w="http://schemas.openxmlformats.org/wordprocessingml/2006/main" xmlns:w14="http://schemas.microsoft.com/office/word/2010/wordml" xmlns:w15="http://schemas.microsoft.com/office/word/2012/wordml" xmlns:w16se="http://schemas.microsoft.com/office/word/2015/wordml/symex" xmlns:wpg="http://schemas.microsoft.com/office/word/2010/wordprocessingGroup" xmlns:wpi="http://schemas.microsoft.com/office/word/2010/wordprocessingInk" xmlns:wne="http://schemas.microsoft.com/office/word/2006/wordml" xmlns:wps="http://schemas.microsoft.com/office/word/2010/wordprocessingShape" mc:Ignorable="w14 w15 w16se wp14">
+<w:hdr xmlns:wpc="http://schemas.microsoft.com/office/word/2010/wordprocessingCanvas" xmlns:cx="http://schemas.microsoft.com/office/drawing/2014/chartex" xmlns:cx1="http://schemas.microsoft.com/office/drawing/2015/9/8/chartex" xmlns:cx2="http://schemas.microsoft.com/office/drawing/2015/10/21/chartex" xmlns:cx3="http://schemas.microsoft.com/office/drawing/2016/5/9/chartex" xmlns:cx4="http://schemas.microsoft.com/office/drawing/2016/5/10/chartex" xmlns:cx5="http://schemas.microsoft.com/office/drawing/2016/5/11/chartex" xmlns:cx6="http://schemas.microsoft.com/office/drawing/2016/5/12/chartex" xmlns:cx7="http://schemas.microsoft.com/office/drawing/2016/5/13/chartex" xmlns:cx8="http://schemas.microsoft.com/office/drawing/2016/5/14/chartex" xmlns:mc="http://schemas.openxmlformats.org/markup-compatibility/2006" xmlns:aink="http://schemas.microsoft.com/office/drawing/2016/ink" xmlns:am3d="http://schemas.microsoft.com/office/drawing/2017/model3d" xmlns:o="urn:schemas-microsoft-com:office:office" xmlns:oel="http://schemas.microsoft.com/office/2019/extlst" xmlns:r="http://schemas.openxmlformats.org/officeDocument/2006/relationships" xmlns:m="http://schemas.openxmlformats.org/officeDocument/2006/math" xmlns:v="urn:schemas-microsoft-com:vml" xmlns:wp14="http://schemas.microsoft.com/office/word/2010/wordprocessingDrawing" xmlns:wp="http://schemas.openxmlformats.org/drawingml/2006/wordprocessingDrawing" xmlns:w10="urn:schemas-microsoft-com:office:word" xmlns:w="http://schemas.openxmlformats.org/wordprocessingml/2006/main" xmlns:w14="http://schemas.microsoft.com/office/word/2010/wordml" xmlns:w15="http://schemas.microsoft.com/office/word/2012/wordml" xmlns:w16cex="http://schemas.microsoft.com/office/word/2018/wordml/cex" xmlns:w16cid="http://schemas.microsoft.com/office/word/2016/wordml/cid" xmlns:w16="http://schemas.microsoft.com/office/word/2018/wordml" xmlns:w16du="http://schemas.microsoft.com/office/word/2023/wordml/word16du" xmlns:w16sdtdh="http://schemas.microsoft.com/office/word/2020/wordml/sdtdatahash" xmlns:w16sdtfl="http://schemas.microsoft.com/office/word/2024/wordml/sdtformatlock" xmlns:w16se="http://schemas.microsoft.com/office/word/2015/wordml/symex" xmlns:wpg="http://schemas.microsoft.com/office/word/2010/wordprocessingGroup" xmlns:wpi="http://schemas.microsoft.com/office/word/2010/wordprocessingInk" xmlns:wne="http://schemas.microsoft.com/office/word/2006/wordml" xmlns:wps="http://schemas.microsoft.com/office/word/2010/wordprocessingShape" mc:Ignorable="w14 w15 w16se w16cid w16 w16cex w16sdtdh w16sdtfl w16du wp14">
   <w:p>
     <w:pPr>
       <w:pStyle w:val="Cabealho"/>
@@ -1167,7 +1878,7 @@
 </file>
 
 <file path=word/header2.xml><?xml version="1.0" encoding="utf-8"?>
-<w:hdr xmlns:wpc="http://schemas.microsoft.com/office/word/2010/wordprocessingCanvas" xmlns:cx="http://schemas.microsoft.com/office/drawing/2014/chartex" xmlns:cx1="http://schemas.microsoft.com/office/drawing/2015/9/8/chartex" xmlns:mc="http://schemas.openxmlformats.org/markup-compatibility/2006" xmlns:o="urn:schemas-microsoft-com:office:office" xmlns:r="http://schemas.openxmlformats.org/officeDocument/2006/relationships" xmlns:m="http://schemas.openxmlformats.org/officeDocument/2006/math" xmlns:v="urn:schemas-microsoft-com:vml" xmlns:wp14="http://schemas.microsoft.com/office/word/2010/wordprocessingDrawing" xmlns:wp="http://schemas.openxmlformats.org/drawingml/2006/wordprocessingDrawing" xmlns:w10="urn:schemas-microsoft-com:office:word" xmlns:w="http://schemas.openxmlformats.org/wordprocessingml/2006/main" xmlns:w14="http://schemas.microsoft.com/office/word/2010/wordml" xmlns:w15="http://schemas.microsoft.com/office/word/2012/wordml" xmlns:w16se="http://schemas.microsoft.com/office/word/2015/wordml/symex" xmlns:wpg="http://schemas.microsoft.com/office/word/2010/wordprocessingGroup" xmlns:wpi="http://schemas.microsoft.com/office/word/2010/wordprocessingInk" xmlns:wne="http://schemas.microsoft.com/office/word/2006/wordml" xmlns:wps="http://schemas.microsoft.com/office/word/2010/wordprocessingShape" mc:Ignorable="w14 w15 w16se wp14">
+<w:hdr xmlns:wpc="http://schemas.microsoft.com/office/word/2010/wordprocessingCanvas" xmlns:cx="http://schemas.microsoft.com/office/drawing/2014/chartex" xmlns:cx1="http://schemas.microsoft.com/office/drawing/2015/9/8/chartex" xmlns:cx2="http://schemas.microsoft.com/office/drawing/2015/10/21/chartex" xmlns:cx3="http://schemas.microsoft.com/office/drawing/2016/5/9/chartex" xmlns:cx4="http://schemas.microsoft.com/office/drawing/2016/5/10/chartex" xmlns:cx5="http://schemas.microsoft.com/office/drawing/2016/5/11/chartex" xmlns:cx6="http://schemas.microsoft.com/office/drawing/2016/5/12/chartex" xmlns:cx7="http://schemas.microsoft.com/office/drawing/2016/5/13/chartex" xmlns:cx8="http://schemas.microsoft.com/office/drawing/2016/5/14/chartex" xmlns:mc="http://schemas.openxmlformats.org/markup-compatibility/2006" xmlns:aink="http://schemas.microsoft.com/office/drawing/2016/ink" xmlns:am3d="http://schemas.microsoft.com/office/drawing/2017/model3d" xmlns:o="urn:schemas-microsoft-com:office:office" xmlns:oel="http://schemas.microsoft.com/office/2019/extlst" xmlns:r="http://schemas.openxmlformats.org/officeDocument/2006/relationships" xmlns:m="http://schemas.openxmlformats.org/officeDocument/2006/math" xmlns:v="urn:schemas-microsoft-com:vml" xmlns:wp14="http://schemas.microsoft.com/office/word/2010/wordprocessingDrawing" xmlns:wp="http://schemas.openxmlformats.org/drawingml/2006/wordprocessingDrawing" xmlns:w10="urn:schemas-microsoft-com:office:word" xmlns:w="http://schemas.openxmlformats.org/wordprocessingml/2006/main" xmlns:w14="http://schemas.microsoft.com/office/word/2010/wordml" xmlns:w15="http://schemas.microsoft.com/office/word/2012/wordml" xmlns:w16cex="http://schemas.microsoft.com/office/word/2018/wordml/cex" xmlns:w16cid="http://schemas.microsoft.com/office/word/2016/wordml/cid" xmlns:w16="http://schemas.microsoft.com/office/word/2018/wordml" xmlns:w16du="http://schemas.microsoft.com/office/word/2023/wordml/word16du" xmlns:w16sdtdh="http://schemas.microsoft.com/office/word/2020/wordml/sdtdatahash" xmlns:w16sdtfl="http://schemas.microsoft.com/office/word/2024/wordml/sdtformatlock" xmlns:w16se="http://schemas.microsoft.com/office/word/2015/wordml/symex" xmlns:wpg="http://schemas.microsoft.com/office/word/2010/wordprocessingGroup" xmlns:wpi="http://schemas.microsoft.com/office/word/2010/wordprocessingInk" xmlns:wne="http://schemas.microsoft.com/office/word/2006/wordml" xmlns:wps="http://schemas.microsoft.com/office/word/2010/wordprocessingShape" mc:Ignorable="w14 w15 w16se w16cid w16 w16cex w16sdtdh w16sdtfl w16du wp14">
   <w:p>
     <w:pPr>
       <w:pStyle w:val="Cabealho"/>
@@ -1183,7 +1894,7 @@
 </file>
 
 <file path=word/header3.xml><?xml version="1.0" encoding="utf-8"?>
-<w:hdr xmlns:wpc="http://schemas.microsoft.com/office/word/2010/wordprocessingCanvas" xmlns:cx="http://schemas.microsoft.com/office/drawing/2014/chartex" xmlns:cx1="http://schemas.microsoft.com/office/drawing/2015/9/8/chartex" xmlns:mc="http://schemas.openxmlformats.org/markup-compatibility/2006" xmlns:o="urn:schemas-microsoft-com:office:office" xmlns:r="http://schemas.openxmlformats.org/officeDocument/2006/relationships" xmlns:m="http://schemas.openxmlformats.org/officeDocument/2006/math" xmlns:v="urn:schemas-microsoft-com:vml" xmlns:wp14="http://schemas.microsoft.com/office/word/2010/wordprocessingDrawing" xmlns:wp="http://schemas.openxmlformats.org/drawingml/2006/wordprocessingDrawing" xmlns:w10="urn:schemas-microsoft-com:office:word" xmlns:w="http://schemas.openxmlformats.org/wordprocessingml/2006/main" xmlns:w14="http://schemas.microsoft.com/office/word/2010/wordml" xmlns:w15="http://schemas.microsoft.com/office/word/2012/wordml" xmlns:w16se="http://schemas.microsoft.com/office/word/2015/wordml/symex" xmlns:wpg="http://schemas.microsoft.com/office/word/2010/wordprocessingGroup" xmlns:wpi="http://schemas.microsoft.com/office/word/2010/wordprocessingInk" xmlns:wne="http://schemas.microsoft.com/office/word/2006/wordml" xmlns:wps="http://schemas.microsoft.com/office/word/2010/wordprocessingShape" mc:Ignorable="w14 w15 w16se wp14">
+<w:hdr xmlns:wpc="http://schemas.microsoft.com/office/word/2010/wordprocessingCanvas" xmlns:cx="http://schemas.microsoft.com/office/drawing/2014/chartex" xmlns:cx1="http://schemas.microsoft.com/office/drawing/2015/9/8/chartex" xmlns:cx2="http://schemas.microsoft.com/office/drawing/2015/10/21/chartex" xmlns:cx3="http://schemas.microsoft.com/office/drawing/2016/5/9/chartex" xmlns:cx4="http://schemas.microsoft.com/office/drawing/2016/5/10/chartex" xmlns:cx5="http://schemas.microsoft.com/office/drawing/2016/5/11/chartex" xmlns:cx6="http://schemas.microsoft.com/office/drawing/2016/5/12/chartex" xmlns:cx7="http://schemas.microsoft.com/office/drawing/2016/5/13/chartex" xmlns:cx8="http://schemas.microsoft.com/office/drawing/2016/5/14/chartex" xmlns:mc="http://schemas.openxmlformats.org/markup-compatibility/2006" xmlns:aink="http://schemas.microsoft.com/office/drawing/2016/ink" xmlns:am3d="http://schemas.microsoft.com/office/drawing/2017/model3d" xmlns:o="urn:schemas-microsoft-com:office:office" xmlns:oel="http://schemas.microsoft.com/office/2019/extlst" xmlns:r="http://schemas.openxmlformats.org/officeDocument/2006/relationships" xmlns:m="http://schemas.openxmlformats.org/officeDocument/2006/math" xmlns:v="urn:schemas-microsoft-com:vml" xmlns:wp14="http://schemas.microsoft.com/office/word/2010/wordprocessingDrawing" xmlns:wp="http://schemas.openxmlformats.org/drawingml/2006/wordprocessingDrawing" xmlns:w10="urn:schemas-microsoft-com:office:word" xmlns:w="http://schemas.openxmlformats.org/wordprocessingml/2006/main" xmlns:w14="http://schemas.microsoft.com/office/word/2010/wordml" xmlns:w15="http://schemas.microsoft.com/office/word/2012/wordml" xmlns:w16cex="http://schemas.microsoft.com/office/word/2018/wordml/cex" xmlns:w16cid="http://schemas.microsoft.com/office/word/2016/wordml/cid" xmlns:w16="http://schemas.microsoft.com/office/word/2018/wordml" xmlns:w16du="http://schemas.microsoft.com/office/word/2023/wordml/word16du" xmlns:w16sdtdh="http://schemas.microsoft.com/office/word/2020/wordml/sdtdatahash" xmlns:w16sdtfl="http://schemas.microsoft.com/office/word/2024/wordml/sdtformatlock" xmlns:w16se="http://schemas.microsoft.com/office/word/2015/wordml/symex" xmlns:wpg="http://schemas.microsoft.com/office/word/2010/wordprocessingGroup" xmlns:wpi="http://schemas.microsoft.com/office/word/2010/wordprocessingInk" xmlns:wne="http://schemas.microsoft.com/office/word/2006/wordml" xmlns:wps="http://schemas.microsoft.com/office/word/2010/wordprocessingShape" mc:Ignorable="w14 w15 w16se w16cid w16 w16cex w16sdtdh w16sdtfl w16du wp14">
   <w:p>
     <w:pPr>
       <w:pStyle w:val="Cabealho"/>
@@ -1192,8 +1903,129 @@
 </w:hdr>
 </file>
 
+<file path=word/numbering.xml><?xml version="1.0" encoding="utf-8"?>
+<w:numbering xmlns:wpc="http://schemas.microsoft.com/office/word/2010/wordprocessingCanvas" xmlns:cx="http://schemas.microsoft.com/office/drawing/2014/chartex" xmlns:cx1="http://schemas.microsoft.com/office/drawing/2015/9/8/chartex" xmlns:cx2="http://schemas.microsoft.com/office/drawing/2015/10/21/chartex" xmlns:cx3="http://schemas.microsoft.com/office/drawing/2016/5/9/chartex" xmlns:cx4="http://schemas.microsoft.com/office/drawing/2016/5/10/chartex" xmlns:cx5="http://schemas.microsoft.com/office/drawing/2016/5/11/chartex" xmlns:cx6="http://schemas.microsoft.com/office/drawing/2016/5/12/chartex" xmlns:cx7="http://schemas.microsoft.com/office/drawing/2016/5/13/chartex" xmlns:cx8="http://schemas.microsoft.com/office/drawing/2016/5/14/chartex" xmlns:mc="http://schemas.openxmlformats.org/markup-compatibility/2006" xmlns:aink="http://schemas.microsoft.com/office/drawing/2016/ink" xmlns:am3d="http://schemas.microsoft.com/office/drawing/2017/model3d" xmlns:o="urn:schemas-microsoft-com:office:office" xmlns:oel="http://schemas.microsoft.com/office/2019/extlst" xmlns:r="http://schemas.openxmlformats.org/officeDocument/2006/relationships" xmlns:m="http://schemas.openxmlformats.org/officeDocument/2006/math" xmlns:v="urn:schemas-microsoft-com:vml" xmlns:wp14="http://schemas.microsoft.com/office/word/2010/wordprocessingDrawing" xmlns:wp="http://schemas.openxmlformats.org/drawingml/2006/wordprocessingDrawing" xmlns:w10="urn:schemas-microsoft-com:office:word" xmlns:w="http://schemas.openxmlformats.org/wordprocessingml/2006/main" xmlns:w14="http://schemas.microsoft.com/office/word/2010/wordml" xmlns:w15="http://schemas.microsoft.com/office/word/2012/wordml" xmlns:w16cex="http://schemas.microsoft.com/office/word/2018/wordml/cex" xmlns:w16cid="http://schemas.microsoft.com/office/word/2016/wordml/cid" xmlns:w16="http://schemas.microsoft.com/office/word/2018/wordml" xmlns:w16du="http://schemas.microsoft.com/office/word/2023/wordml/word16du" xmlns:w16sdtdh="http://schemas.microsoft.com/office/word/2020/wordml/sdtdatahash" xmlns:w16sdtfl="http://schemas.microsoft.com/office/word/2024/wordml/sdtformatlock" xmlns:w16se="http://schemas.microsoft.com/office/word/2015/wordml/symex" xmlns:wpg="http://schemas.microsoft.com/office/word/2010/wordprocessingGroup" xmlns:wpi="http://schemas.microsoft.com/office/word/2010/wordprocessingInk" xmlns:wne="http://schemas.microsoft.com/office/word/2006/wordml" xmlns:wps="http://schemas.microsoft.com/office/word/2010/wordprocessingShape" mc:Ignorable="w14 w15 w16se w16cid w16 w16cex w16sdtdh w16sdtfl w16du wp14">
+  <w:abstractNum w:abstractNumId="0" w15:restartNumberingAfterBreak="0">
+    <w:nsid w:val="167C3704"/>
+    <w:multiLevelType w:val="multilevel"/>
+    <w:tmpl w:val="218C3912"/>
+    <w:lvl w:ilvl="0">
+      <w:start w:val="1"/>
+      <w:numFmt w:val="decimal"/>
+      <w:lvlText w:val="%1"/>
+      <w:lvlJc w:val="left"/>
+      <w:pPr>
+        <w:ind w:left="360" w:hanging="360"/>
+      </w:pPr>
+      <w:rPr>
+        <w:rFonts w:hint="default"/>
+      </w:rPr>
+    </w:lvl>
+    <w:lvl w:ilvl="1">
+      <w:start w:val="1"/>
+      <w:numFmt w:val="decimal"/>
+      <w:lvlText w:val="%1.%2"/>
+      <w:lvlJc w:val="left"/>
+      <w:pPr>
+        <w:ind w:left="360" w:hanging="360"/>
+      </w:pPr>
+      <w:rPr>
+        <w:rFonts w:hint="default"/>
+      </w:rPr>
+    </w:lvl>
+    <w:lvl w:ilvl="2">
+      <w:start w:val="1"/>
+      <w:numFmt w:val="decimal"/>
+      <w:lvlText w:val="%1.%2.%3"/>
+      <w:lvlJc w:val="left"/>
+      <w:pPr>
+        <w:ind w:left="720" w:hanging="720"/>
+      </w:pPr>
+      <w:rPr>
+        <w:rFonts w:hint="default"/>
+      </w:rPr>
+    </w:lvl>
+    <w:lvl w:ilvl="3">
+      <w:start w:val="1"/>
+      <w:numFmt w:val="decimal"/>
+      <w:lvlText w:val="%1.%2.%3.%4"/>
+      <w:lvlJc w:val="left"/>
+      <w:pPr>
+        <w:ind w:left="720" w:hanging="720"/>
+      </w:pPr>
+      <w:rPr>
+        <w:rFonts w:hint="default"/>
+      </w:rPr>
+    </w:lvl>
+    <w:lvl w:ilvl="4">
+      <w:start w:val="1"/>
+      <w:numFmt w:val="decimal"/>
+      <w:lvlText w:val="%1.%2.%3.%4.%5"/>
+      <w:lvlJc w:val="left"/>
+      <w:pPr>
+        <w:ind w:left="1080" w:hanging="1080"/>
+      </w:pPr>
+      <w:rPr>
+        <w:rFonts w:hint="default"/>
+      </w:rPr>
+    </w:lvl>
+    <w:lvl w:ilvl="5">
+      <w:start w:val="1"/>
+      <w:numFmt w:val="decimal"/>
+      <w:lvlText w:val="%1.%2.%3.%4.%5.%6"/>
+      <w:lvlJc w:val="left"/>
+      <w:pPr>
+        <w:ind w:left="1080" w:hanging="1080"/>
+      </w:pPr>
+      <w:rPr>
+        <w:rFonts w:hint="default"/>
+      </w:rPr>
+    </w:lvl>
+    <w:lvl w:ilvl="6">
+      <w:start w:val="1"/>
+      <w:numFmt w:val="decimal"/>
+      <w:lvlText w:val="%1.%2.%3.%4.%5.%6.%7"/>
+      <w:lvlJc w:val="left"/>
+      <w:pPr>
+        <w:ind w:left="1440" w:hanging="1440"/>
+      </w:pPr>
+      <w:rPr>
+        <w:rFonts w:hint="default"/>
+      </w:rPr>
+    </w:lvl>
+    <w:lvl w:ilvl="7">
+      <w:start w:val="1"/>
+      <w:numFmt w:val="decimal"/>
+      <w:lvlText w:val="%1.%2.%3.%4.%5.%6.%7.%8"/>
+      <w:lvlJc w:val="left"/>
+      <w:pPr>
+        <w:ind w:left="1440" w:hanging="1440"/>
+      </w:pPr>
+      <w:rPr>
+        <w:rFonts w:hint="default"/>
+      </w:rPr>
+    </w:lvl>
+    <w:lvl w:ilvl="8">
+      <w:start w:val="1"/>
+      <w:numFmt w:val="decimal"/>
+      <w:lvlText w:val="%1.%2.%3.%4.%5.%6.%7.%8.%9"/>
+      <w:lvlJc w:val="left"/>
+      <w:pPr>
+        <w:ind w:left="1440" w:hanging="1440"/>
+      </w:pPr>
+      <w:rPr>
+        <w:rFonts w:hint="default"/>
+      </w:rPr>
+    </w:lvl>
+  </w:abstractNum>
+  <w:num w:numId="1" w16cid:durableId="1472795191">
+    <w:abstractNumId w:val="0"/>
+  </w:num>
+</w:numbering>
+</file>
+
 <file path=word/styles.xml><?xml version="1.0" encoding="utf-8"?>
-<w:styles xmlns:mc="http://schemas.openxmlformats.org/markup-compatibility/2006" xmlns:r="http://schemas.openxmlformats.org/officeDocument/2006/relationships" xmlns:w="http://schemas.openxmlformats.org/wordprocessingml/2006/main" xmlns:w14="http://schemas.microsoft.com/office/word/2010/wordml" xmlns:w15="http://schemas.microsoft.com/office/word/2012/wordml" xmlns:w16se="http://schemas.microsoft.com/office/word/2015/wordml/symex" mc:Ignorable="w14 w15 w16se">
+<w:styles xmlns:mc="http://schemas.openxmlformats.org/markup-compatibility/2006" xmlns:r="http://schemas.openxmlformats.org/officeDocument/2006/relationships" xmlns:w="http://schemas.openxmlformats.org/wordprocessingml/2006/main" xmlns:w14="http://schemas.microsoft.com/office/word/2010/wordml" xmlns:w15="http://schemas.microsoft.com/office/word/2012/wordml" xmlns:w16cex="http://schemas.microsoft.com/office/word/2018/wordml/cex" xmlns:w16cid="http://schemas.microsoft.com/office/word/2016/wordml/cid" xmlns:w16="http://schemas.microsoft.com/office/word/2018/wordml" xmlns:w16du="http://schemas.microsoft.com/office/word/2023/wordml/word16du" xmlns:w16sdtdh="http://schemas.microsoft.com/office/word/2020/wordml/sdtdatahash" xmlns:w16sdtfl="http://schemas.microsoft.com/office/word/2024/wordml/sdtformatlock" xmlns:w16se="http://schemas.microsoft.com/office/word/2015/wordml/symex" mc:Ignorable="w14 w15 w16se w16cid w16 w16cex w16sdtdh w16sdtfl w16du">
   <w:docDefaults>
     <w:rPrDefault>
       <w:rPr>
@@ -1209,7 +2041,7 @@
       </w:pPr>
     </w:pPrDefault>
   </w:docDefaults>
-  <w:latentStyles w:defLockedState="0" w:defUIPriority="99" w:defSemiHidden="0" w:defUnhideWhenUsed="0" w:defQFormat="0" w:count="371">
+  <w:latentStyles w:defLockedState="0" w:defUIPriority="99" w:defSemiHidden="0" w:defUnhideWhenUsed="0" w:defQFormat="0" w:count="376">
     <w:lsdException w:name="Normal" w:uiPriority="0" w:qFormat="1"/>
     <w:lsdException w:name="heading 1" w:uiPriority="9" w:qFormat="1"/>
     <w:lsdException w:name="heading 2" w:semiHidden="1" w:uiPriority="9" w:unhideWhenUsed="1" w:qFormat="1"/>
@@ -1581,11 +2413,16 @@
     <w:lsdException w:name="List Table 5 Dark Accent 6" w:uiPriority="50"/>
     <w:lsdException w:name="List Table 6 Colorful Accent 6" w:uiPriority="51"/>
     <w:lsdException w:name="List Table 7 Colorful Accent 6" w:uiPriority="52"/>
+    <w:lsdException w:name="Mention" w:semiHidden="1" w:unhideWhenUsed="1"/>
+    <w:lsdException w:name="Smart Hyperlink" w:semiHidden="1" w:unhideWhenUsed="1"/>
+    <w:lsdException w:name="Hashtag" w:semiHidden="1" w:unhideWhenUsed="1"/>
+    <w:lsdException w:name="Unresolved Mention" w:semiHidden="1" w:unhideWhenUsed="1"/>
+    <w:lsdException w:name="Smart Link" w:semiHidden="1" w:unhideWhenUsed="1"/>
   </w:latentStyles>
   <w:style w:type="paragraph" w:default="1" w:styleId="Normal">
     <w:name w:val="Normal"/>
     <w:qFormat/>
-    <w:rsid w:val="004B70AF"/>
+    <w:rsid w:val="00083EB9"/>
     <w:pPr>
       <w:spacing w:after="200" w:line="276" w:lineRule="auto"/>
     </w:pPr>
@@ -1690,7 +2527,6 @@
   <w:style w:type="character" w:default="1" w:styleId="Fontepargpadro">
     <w:name w:val="Default Paragraph Font"/>
     <w:uiPriority w:val="1"/>
-    <w:semiHidden/>
     <w:unhideWhenUsed/>
   </w:style>
   <w:style w:type="table" w:default="1" w:styleId="Tabelanormal">
@@ -1832,6 +2668,19 @@
       <w:sz w:val="18"/>
       <w:szCs w:val="20"/>
       <w:lang w:eastAsia="pt-BR"/>
+    </w:rPr>
+  </w:style>
+  <w:style w:type="paragraph" w:styleId="NormalWeb">
+    <w:name w:val="Normal (Web)"/>
+    <w:basedOn w:val="Normal"/>
+    <w:uiPriority w:val="99"/>
+    <w:semiHidden/>
+    <w:unhideWhenUsed/>
+    <w:rsid w:val="00020FED"/>
+    <w:rPr>
+      <w:rFonts w:ascii="Times New Roman" w:hAnsi="Times New Roman" w:cs="Times New Roman"/>
+      <w:sz w:val="24"/>
+      <w:szCs w:val="24"/>
     </w:rPr>
   </w:style>
 </w:styles>

</xml_diff>